<commit_message>
CS1102 Unit 1: Replace text outputs with IntelliJ screenshot placeholders in assignment doc
</commit_message>
<xml_diff>
--- a/CS1102_Programming_1/Unit1_Intro_Java/Assignment/Unit1_Programming_Assignment.docx
+++ b/CS1102_Programming_1/Unit1_Intro_Java/Assignment/Unit1_Programming_Assignment.docx
@@ -2,7 +2,7 @@
 <file path=word/document.xml><?xml version="1.0" encoding="utf-8"?>
 <w:document xmlns:w="http://schemas.openxmlformats.org/wordprocessingml/2006/main" xmlns:m="http://schemas.openxmlformats.org/officeDocument/2006/math" xmlns:r="http://schemas.openxmlformats.org/officeDocument/2006/relationships" xmlns:o="urn:schemas-microsoft-com:office:office" xmlns:v="urn:schemas-microsoft-com:vml" xmlns:w10="urn:schemas-microsoft-com:office:word" xmlns:a="http://schemas.openxmlformats.org/drawingml/2006/main" xmlns:pic="http://schemas.openxmlformats.org/drawingml/2006/picture" xmlns:wp="http://schemas.openxmlformats.org/drawingml/2006/wordprocessingDrawing">
   <w:body>
-    <w:bookmarkStart w:id="22" w:name="cs-1102-unit-1-programming-assignment"/>
+    <w:bookmarkStart w:id="23" w:name="cs-1102-unit-1-programming-assignment"/>
     <w:p>
       <w:pPr>
         <w:pStyle w:val="Heading1"/>
@@ -17276,7 +17276,7 @@
       </w:r>
     </w:p>
     <w:bookmarkEnd w:id="15"/>
-    <w:bookmarkStart w:id="19" w:name="console-output-rubric-criterion-5"/>
+    <w:bookmarkStart w:id="20" w:name="output-rubric-criterion-5"/>
     <w:p>
       <w:pPr>
         <w:pStyle w:val="Heading2"/>
@@ -17287,7 +17287,7 @@
           <w:rFonts w:ascii="Times New Roman" w:hAnsi="Times New Roman"/>
           <w:sz w:val="24"/>
         </w:rPr>
-        <w:t xml:space="preserve">7. Console Output (Rubric Criterion 5)</w:t>
+        <w:t xml:space="preserve">7. Output (Rubric Criterion 5)</w:t>
       </w:r>
     </w:p>
     <w:p>
@@ -17298,14 +17298,26 @@
       <w:r>
         <w:rPr>
           <w:rFonts w:ascii="Times New Roman" w:hAnsi="Times New Roman"/>
-          <w:i/>
-          <w:iCs/>
-          <w:sz w:val="24"/>
-        </w:rPr>
-        <w:t xml:space="preserve">Note: Screenshots of the program running in Eclipse IDE are included in the submitted Word document.</w:t>
+          <w:sz w:val="24"/>
+        </w:rPr>
+        <w:t xml:space="preserve">The output rubric requires three items: a screenshot of the program output, the code file (included in Section 6 above), and a screenshot of the code running in the IDE. All three are provided below.</w:t>
       </w:r>
     </w:p>
-    <w:bookmarkStart w:id="16" w:name="test-run-1-all-correct-answers-b-c-c-b-d"/>
+    <w:p>
+      <w:pPr>
+        <w:spacing w:line="480" w:lineRule="exact" w:after="0"/>
+      </w:pPr>
+      <w:r>
+        <w:rPr>
+          <w:rFonts w:ascii="Times New Roman" w:hAnsi="Times New Roman"/>
+          <w:sz w:val="24"/>
+        </w:rPr>
+        <w:pict>
+          <v:rect style="width:0;height:1.5pt" o:hralign="center" o:hrstd="t" o:hr="t"/>
+        </w:pict>
+      </w:r>
+    </w:p>
+    <w:bookmarkStart w:id="16" w:name="X7a93ca9e2b01bb7868a5ab76da982d7a554a667"/>
     <w:p>
       <w:pPr>
         <w:pStyle w:val="Heading3"/>
@@ -17316,1584 +17328,7 @@
           <w:rFonts w:ascii="Times New Roman" w:hAnsi="Times New Roman"/>
           <w:sz w:val="24"/>
         </w:rPr>
-        <w:t xml:space="preserve">Test Run 1 — All Correct Answers (B, C, C, B, D)</w:t>
-      </w:r>
-    </w:p>
-    <w:p>
-      <w:pPr>
-        <w:pStyle w:val="SourceCode"/>
-        <w:spacing w:line="480" w:lineRule="exact" w:after="0"/>
-      </w:pPr>
-      <w:r>
-        <w:rPr>
-          <w:rStyle w:val="VerbatimChar"/>
-          <w:rFonts w:ascii="Times New Roman" w:hAnsi="Times New Roman"/>
-          <w:sz w:val="24"/>
-        </w:rPr>
-        <w:t xml:space="preserve">============================================</w:t>
-      </w:r>
-      <w:r>
-        <w:rPr>
-          <w:rFonts w:ascii="Times New Roman" w:hAnsi="Times New Roman"/>
-          <w:sz w:val="24"/>
-        </w:rPr>
-        <w:br/>
-      </w:r>
-      <w:r>
-        <w:rPr>
-          <w:rStyle w:val="VerbatimChar"/>
-          <w:rFonts w:ascii="Times New Roman" w:hAnsi="Times New Roman"/>
-          <w:sz w:val="24"/>
-        </w:rPr>
-        <w:t xml:space="preserve">        Welcome to the Java Quiz Game</w:t>
-      </w:r>
-      <w:r>
-        <w:rPr>
-          <w:rFonts w:ascii="Times New Roman" w:hAnsi="Times New Roman"/>
-          <w:sz w:val="24"/>
-        </w:rPr>
-        <w:br/>
-      </w:r>
-      <w:r>
-        <w:rPr>
-          <w:rStyle w:val="VerbatimChar"/>
-          <w:rFonts w:ascii="Times New Roman" w:hAnsi="Times New Roman"/>
-          <w:sz w:val="24"/>
-        </w:rPr>
-        <w:t xml:space="preserve">============================================</w:t>
-      </w:r>
-      <w:r>
-        <w:rPr>
-          <w:rFonts w:ascii="Times New Roman" w:hAnsi="Times New Roman"/>
-          <w:sz w:val="24"/>
-        </w:rPr>
-        <w:br/>
-      </w:r>
-      <w:r>
-        <w:rPr>
-          <w:rStyle w:val="VerbatimChar"/>
-          <w:rFonts w:ascii="Times New Roman" w:hAnsi="Times New Roman"/>
-          <w:sz w:val="24"/>
-        </w:rPr>
-        <w:t xml:space="preserve">Type A, B, C, or D to answer each question.</w:t>
-      </w:r>
-      <w:r>
-        <w:rPr>
-          <w:rFonts w:ascii="Times New Roman" w:hAnsi="Times New Roman"/>
-          <w:sz w:val="24"/>
-        </w:rPr>
-        <w:br/>
-      </w:r>
-      <w:r>
-        <w:rPr>
-          <w:rFonts w:ascii="Times New Roman" w:hAnsi="Times New Roman"/>
-          <w:sz w:val="24"/>
-        </w:rPr>
-        <w:br/>
-      </w:r>
-      <w:r>
-        <w:rPr>
-          <w:rStyle w:val="VerbatimChar"/>
-          <w:rFonts w:ascii="Times New Roman" w:hAnsi="Times New Roman"/>
-          <w:sz w:val="24"/>
-        </w:rPr>
-        <w:t xml:space="preserve">Question 1: Which keyword is used to define a class in Java?</w:t>
-      </w:r>
-      <w:r>
-        <w:rPr>
-          <w:rFonts w:ascii="Times New Roman" w:hAnsi="Times New Roman"/>
-          <w:sz w:val="24"/>
-        </w:rPr>
-        <w:br/>
-      </w:r>
-      <w:r>
-        <w:rPr>
-          <w:rStyle w:val="VerbatimChar"/>
-          <w:rFonts w:ascii="Times New Roman" w:hAnsi="Times New Roman"/>
-          <w:sz w:val="24"/>
-        </w:rPr>
-        <w:t xml:space="preserve">  A. define</w:t>
-      </w:r>
-      <w:r>
-        <w:rPr>
-          <w:rFonts w:ascii="Times New Roman" w:hAnsi="Times New Roman"/>
-          <w:sz w:val="24"/>
-        </w:rPr>
-        <w:br/>
-      </w:r>
-      <w:r>
-        <w:rPr>
-          <w:rStyle w:val="VerbatimChar"/>
-          <w:rFonts w:ascii="Times New Roman" w:hAnsi="Times New Roman"/>
-          <w:sz w:val="24"/>
-        </w:rPr>
-        <w:t xml:space="preserve">  B. class</w:t>
-      </w:r>
-      <w:r>
-        <w:rPr>
-          <w:rFonts w:ascii="Times New Roman" w:hAnsi="Times New Roman"/>
-          <w:sz w:val="24"/>
-        </w:rPr>
-        <w:br/>
-      </w:r>
-      <w:r>
-        <w:rPr>
-          <w:rStyle w:val="VerbatimChar"/>
-          <w:rFonts w:ascii="Times New Roman" w:hAnsi="Times New Roman"/>
-          <w:sz w:val="24"/>
-        </w:rPr>
-        <w:t xml:space="preserve">  C. struct</w:t>
-      </w:r>
-      <w:r>
-        <w:rPr>
-          <w:rFonts w:ascii="Times New Roman" w:hAnsi="Times New Roman"/>
-          <w:sz w:val="24"/>
-        </w:rPr>
-        <w:br/>
-      </w:r>
-      <w:r>
-        <w:rPr>
-          <w:rStyle w:val="VerbatimChar"/>
-          <w:rFonts w:ascii="Times New Roman" w:hAnsi="Times New Roman"/>
-          <w:sz w:val="24"/>
-        </w:rPr>
-        <w:t xml:space="preserve">  D. object</w:t>
-      </w:r>
-      <w:r>
-        <w:rPr>
-          <w:rFonts w:ascii="Times New Roman" w:hAnsi="Times New Roman"/>
-          <w:sz w:val="24"/>
-        </w:rPr>
-        <w:br/>
-      </w:r>
-      <w:r>
-        <w:rPr>
-          <w:rStyle w:val="VerbatimChar"/>
-          <w:rFonts w:ascii="Times New Roman" w:hAnsi="Times New Roman"/>
-          <w:sz w:val="24"/>
-        </w:rPr>
-        <w:t xml:space="preserve">Your answer: B</w:t>
-      </w:r>
-      <w:r>
-        <w:rPr>
-          <w:rFonts w:ascii="Times New Roman" w:hAnsi="Times New Roman"/>
-          <w:sz w:val="24"/>
-        </w:rPr>
-        <w:br/>
-      </w:r>
-      <w:r>
-        <w:rPr>
-          <w:rStyle w:val="VerbatimChar"/>
-          <w:rFonts w:ascii="Times New Roman" w:hAnsi="Times New Roman"/>
-          <w:sz w:val="24"/>
-        </w:rPr>
-        <w:t xml:space="preserve">Correct! 'class' is the keyword used to define a class in Java.</w:t>
-      </w:r>
-      <w:r>
-        <w:rPr>
-          <w:rFonts w:ascii="Times New Roman" w:hAnsi="Times New Roman"/>
-          <w:sz w:val="24"/>
-        </w:rPr>
-        <w:br/>
-      </w:r>
-      <w:r>
-        <w:rPr>
-          <w:rFonts w:ascii="Times New Roman" w:hAnsi="Times New Roman"/>
-          <w:sz w:val="24"/>
-        </w:rPr>
-        <w:br/>
-      </w:r>
-      <w:r>
-        <w:rPr>
-          <w:rStyle w:val="VerbatimChar"/>
-          <w:rFonts w:ascii="Times New Roman" w:hAnsi="Times New Roman"/>
-          <w:sz w:val="24"/>
-        </w:rPr>
-        <w:t xml:space="preserve">Question 2: What is the default value of an int variable in Java?</w:t>
-      </w:r>
-      <w:r>
-        <w:rPr>
-          <w:rFonts w:ascii="Times New Roman" w:hAnsi="Times New Roman"/>
-          <w:sz w:val="24"/>
-        </w:rPr>
-        <w:br/>
-      </w:r>
-      <w:r>
-        <w:rPr>
-          <w:rStyle w:val="VerbatimChar"/>
-          <w:rFonts w:ascii="Times New Roman" w:hAnsi="Times New Roman"/>
-          <w:sz w:val="24"/>
-        </w:rPr>
-        <w:t xml:space="preserve">  A. null</w:t>
-      </w:r>
-      <w:r>
-        <w:rPr>
-          <w:rFonts w:ascii="Times New Roman" w:hAnsi="Times New Roman"/>
-          <w:sz w:val="24"/>
-        </w:rPr>
-        <w:br/>
-      </w:r>
-      <w:r>
-        <w:rPr>
-          <w:rStyle w:val="VerbatimChar"/>
-          <w:rFonts w:ascii="Times New Roman" w:hAnsi="Times New Roman"/>
-          <w:sz w:val="24"/>
-        </w:rPr>
-        <w:t xml:space="preserve">  B. 1</w:t>
-      </w:r>
-      <w:r>
-        <w:rPr>
-          <w:rFonts w:ascii="Times New Roman" w:hAnsi="Times New Roman"/>
-          <w:sz w:val="24"/>
-        </w:rPr>
-        <w:br/>
-      </w:r>
-      <w:r>
-        <w:rPr>
-          <w:rStyle w:val="VerbatimChar"/>
-          <w:rFonts w:ascii="Times New Roman" w:hAnsi="Times New Roman"/>
-          <w:sz w:val="24"/>
-        </w:rPr>
-        <w:t xml:space="preserve">  C. 0</w:t>
-      </w:r>
-      <w:r>
-        <w:rPr>
-          <w:rFonts w:ascii="Times New Roman" w:hAnsi="Times New Roman"/>
-          <w:sz w:val="24"/>
-        </w:rPr>
-        <w:br/>
-      </w:r>
-      <w:r>
-        <w:rPr>
-          <w:rStyle w:val="VerbatimChar"/>
-          <w:rFonts w:ascii="Times New Roman" w:hAnsi="Times New Roman"/>
-          <w:sz w:val="24"/>
-        </w:rPr>
-        <w:t xml:space="preserve">  D. undefined</w:t>
-      </w:r>
-      <w:r>
-        <w:rPr>
-          <w:rFonts w:ascii="Times New Roman" w:hAnsi="Times New Roman"/>
-          <w:sz w:val="24"/>
-        </w:rPr>
-        <w:br/>
-      </w:r>
-      <w:r>
-        <w:rPr>
-          <w:rStyle w:val="VerbatimChar"/>
-          <w:rFonts w:ascii="Times New Roman" w:hAnsi="Times New Roman"/>
-          <w:sz w:val="24"/>
-        </w:rPr>
-        <w:t xml:space="preserve">Your answer: C</w:t>
-      </w:r>
-      <w:r>
-        <w:rPr>
-          <w:rFonts w:ascii="Times New Roman" w:hAnsi="Times New Roman"/>
-          <w:sz w:val="24"/>
-        </w:rPr>
-        <w:br/>
-      </w:r>
-      <w:r>
-        <w:rPr>
-          <w:rStyle w:val="VerbatimChar"/>
-          <w:rFonts w:ascii="Times New Roman" w:hAnsi="Times New Roman"/>
-          <w:sz w:val="24"/>
-        </w:rPr>
-        <w:t xml:space="preserve">Correct! The default value of an int in Java is 0.</w:t>
-      </w:r>
-      <w:r>
-        <w:rPr>
-          <w:rFonts w:ascii="Times New Roman" w:hAnsi="Times New Roman"/>
-          <w:sz w:val="24"/>
-        </w:rPr>
-        <w:br/>
-      </w:r>
-      <w:r>
-        <w:rPr>
-          <w:rFonts w:ascii="Times New Roman" w:hAnsi="Times New Roman"/>
-          <w:sz w:val="24"/>
-        </w:rPr>
-        <w:br/>
-      </w:r>
-      <w:r>
-        <w:rPr>
-          <w:rStyle w:val="VerbatimChar"/>
-          <w:rFonts w:ascii="Times New Roman" w:hAnsi="Times New Roman"/>
-          <w:sz w:val="24"/>
-        </w:rPr>
-        <w:t xml:space="preserve">Question 3: Which of the following is a primitive data type in Java?</w:t>
-      </w:r>
-      <w:r>
-        <w:rPr>
-          <w:rFonts w:ascii="Times New Roman" w:hAnsi="Times New Roman"/>
-          <w:sz w:val="24"/>
-        </w:rPr>
-        <w:br/>
-      </w:r>
-      <w:r>
-        <w:rPr>
-          <w:rStyle w:val="VerbatimChar"/>
-          <w:rFonts w:ascii="Times New Roman" w:hAnsi="Times New Roman"/>
-          <w:sz w:val="24"/>
-        </w:rPr>
-        <w:t xml:space="preserve">  A. String</w:t>
-      </w:r>
-      <w:r>
-        <w:rPr>
-          <w:rFonts w:ascii="Times New Roman" w:hAnsi="Times New Roman"/>
-          <w:sz w:val="24"/>
-        </w:rPr>
-        <w:br/>
-      </w:r>
-      <w:r>
-        <w:rPr>
-          <w:rStyle w:val="VerbatimChar"/>
-          <w:rFonts w:ascii="Times New Roman" w:hAnsi="Times New Roman"/>
-          <w:sz w:val="24"/>
-        </w:rPr>
-        <w:t xml:space="preserve">  B. Array</w:t>
-      </w:r>
-      <w:r>
-        <w:rPr>
-          <w:rFonts w:ascii="Times New Roman" w:hAnsi="Times New Roman"/>
-          <w:sz w:val="24"/>
-        </w:rPr>
-        <w:br/>
-      </w:r>
-      <w:r>
-        <w:rPr>
-          <w:rStyle w:val="VerbatimChar"/>
-          <w:rFonts w:ascii="Times New Roman" w:hAnsi="Times New Roman"/>
-          <w:sz w:val="24"/>
-        </w:rPr>
-        <w:t xml:space="preserve">  C. double</w:t>
-      </w:r>
-      <w:r>
-        <w:rPr>
-          <w:rFonts w:ascii="Times New Roman" w:hAnsi="Times New Roman"/>
-          <w:sz w:val="24"/>
-        </w:rPr>
-        <w:br/>
-      </w:r>
-      <w:r>
-        <w:rPr>
-          <w:rStyle w:val="VerbatimChar"/>
-          <w:rFonts w:ascii="Times New Roman" w:hAnsi="Times New Roman"/>
-          <w:sz w:val="24"/>
-        </w:rPr>
-        <w:t xml:space="preserve">  D. Scanner</w:t>
-      </w:r>
-      <w:r>
-        <w:rPr>
-          <w:rFonts w:ascii="Times New Roman" w:hAnsi="Times New Roman"/>
-          <w:sz w:val="24"/>
-        </w:rPr>
-        <w:br/>
-      </w:r>
-      <w:r>
-        <w:rPr>
-          <w:rStyle w:val="VerbatimChar"/>
-          <w:rFonts w:ascii="Times New Roman" w:hAnsi="Times New Roman"/>
-          <w:sz w:val="24"/>
-        </w:rPr>
-        <w:t xml:space="preserve">Your answer: C</w:t>
-      </w:r>
-      <w:r>
-        <w:rPr>
-          <w:rFonts w:ascii="Times New Roman" w:hAnsi="Times New Roman"/>
-          <w:sz w:val="24"/>
-        </w:rPr>
-        <w:br/>
-      </w:r>
-      <w:r>
-        <w:rPr>
-          <w:rStyle w:val="VerbatimChar"/>
-          <w:rFonts w:ascii="Times New Roman" w:hAnsi="Times New Roman"/>
-          <w:sz w:val="24"/>
-        </w:rPr>
-        <w:t xml:space="preserve">Correct! 'double' is one of Java's eight primitive data types.</w:t>
-      </w:r>
-      <w:r>
-        <w:rPr>
-          <w:rFonts w:ascii="Times New Roman" w:hAnsi="Times New Roman"/>
-          <w:sz w:val="24"/>
-        </w:rPr>
-        <w:br/>
-      </w:r>
-      <w:r>
-        <w:rPr>
-          <w:rFonts w:ascii="Times New Roman" w:hAnsi="Times New Roman"/>
-          <w:sz w:val="24"/>
-        </w:rPr>
-        <w:br/>
-      </w:r>
-      <w:r>
-        <w:rPr>
-          <w:rStyle w:val="VerbatimChar"/>
-          <w:rFonts w:ascii="Times New Roman" w:hAnsi="Times New Roman"/>
-          <w:sz w:val="24"/>
-        </w:rPr>
-        <w:t xml:space="preserve">Question 4: What does the % operator compute in Java?</w:t>
-      </w:r>
-      <w:r>
-        <w:rPr>
-          <w:rFonts w:ascii="Times New Roman" w:hAnsi="Times New Roman"/>
-          <w:sz w:val="24"/>
-        </w:rPr>
-        <w:br/>
-      </w:r>
-      <w:r>
-        <w:rPr>
-          <w:rStyle w:val="VerbatimChar"/>
-          <w:rFonts w:ascii="Times New Roman" w:hAnsi="Times New Roman"/>
-          <w:sz w:val="24"/>
-        </w:rPr>
-        <w:t xml:space="preserve">  A. The result of dividing two numbers</w:t>
-      </w:r>
-      <w:r>
-        <w:rPr>
-          <w:rFonts w:ascii="Times New Roman" w:hAnsi="Times New Roman"/>
-          <w:sz w:val="24"/>
-        </w:rPr>
-        <w:br/>
-      </w:r>
-      <w:r>
-        <w:rPr>
-          <w:rStyle w:val="VerbatimChar"/>
-          <w:rFonts w:ascii="Times New Roman" w:hAnsi="Times New Roman"/>
-          <w:sz w:val="24"/>
-        </w:rPr>
-        <w:t xml:space="preserve">  B. The remainder after integer division</w:t>
-      </w:r>
-      <w:r>
-        <w:rPr>
-          <w:rFonts w:ascii="Times New Roman" w:hAnsi="Times New Roman"/>
-          <w:sz w:val="24"/>
-        </w:rPr>
-        <w:br/>
-      </w:r>
-      <w:r>
-        <w:rPr>
-          <w:rStyle w:val="VerbatimChar"/>
-          <w:rFonts w:ascii="Times New Roman" w:hAnsi="Times New Roman"/>
-          <w:sz w:val="24"/>
-        </w:rPr>
-        <w:t xml:space="preserve">  C. The product of two numbers</w:t>
-      </w:r>
-      <w:r>
-        <w:rPr>
-          <w:rFonts w:ascii="Times New Roman" w:hAnsi="Times New Roman"/>
-          <w:sz w:val="24"/>
-        </w:rPr>
-        <w:br/>
-      </w:r>
-      <w:r>
-        <w:rPr>
-          <w:rStyle w:val="VerbatimChar"/>
-          <w:rFonts w:ascii="Times New Roman" w:hAnsi="Times New Roman"/>
-          <w:sz w:val="24"/>
-        </w:rPr>
-        <w:t xml:space="preserve">  D. A number converted to a percentage</w:t>
-      </w:r>
-      <w:r>
-        <w:rPr>
-          <w:rFonts w:ascii="Times New Roman" w:hAnsi="Times New Roman"/>
-          <w:sz w:val="24"/>
-        </w:rPr>
-        <w:br/>
-      </w:r>
-      <w:r>
-        <w:rPr>
-          <w:rStyle w:val="VerbatimChar"/>
-          <w:rFonts w:ascii="Times New Roman" w:hAnsi="Times New Roman"/>
-          <w:sz w:val="24"/>
-        </w:rPr>
-        <w:t xml:space="preserve">Your answer: B</w:t>
-      </w:r>
-      <w:r>
-        <w:rPr>
-          <w:rFonts w:ascii="Times New Roman" w:hAnsi="Times New Roman"/>
-          <w:sz w:val="24"/>
-        </w:rPr>
-        <w:br/>
-      </w:r>
-      <w:r>
-        <w:rPr>
-          <w:rStyle w:val="VerbatimChar"/>
-          <w:rFonts w:ascii="Times New Roman" w:hAnsi="Times New Roman"/>
-          <w:sz w:val="24"/>
-        </w:rPr>
-        <w:t xml:space="preserve">Correct! % is the modulo operator; it returns the remainder of division.</w:t>
-      </w:r>
-      <w:r>
-        <w:rPr>
-          <w:rFonts w:ascii="Times New Roman" w:hAnsi="Times New Roman"/>
-          <w:sz w:val="24"/>
-        </w:rPr>
-        <w:br/>
-      </w:r>
-      <w:r>
-        <w:rPr>
-          <w:rFonts w:ascii="Times New Roman" w:hAnsi="Times New Roman"/>
-          <w:sz w:val="24"/>
-        </w:rPr>
-        <w:br/>
-      </w:r>
-      <w:r>
-        <w:rPr>
-          <w:rStyle w:val="VerbatimChar"/>
-          <w:rFonts w:ascii="Times New Roman" w:hAnsi="Times New Roman"/>
-          <w:sz w:val="24"/>
-        </w:rPr>
-        <w:t xml:space="preserve">Question 5: Which conditional statement is best suited for testing</w:t>
-      </w:r>
-      <w:r>
-        <w:rPr>
-          <w:rFonts w:ascii="Times New Roman" w:hAnsi="Times New Roman"/>
-          <w:sz w:val="24"/>
-        </w:rPr>
-        <w:br/>
-      </w:r>
-      <w:r>
-        <w:rPr>
-          <w:rStyle w:val="VerbatimChar"/>
-          <w:rFonts w:ascii="Times New Roman" w:hAnsi="Times New Roman"/>
-          <w:sz w:val="24"/>
-        </w:rPr>
-        <w:t xml:space="preserve">           a variable against many fixed, discrete values?</w:t>
-      </w:r>
-      <w:r>
-        <w:rPr>
-          <w:rFonts w:ascii="Times New Roman" w:hAnsi="Times New Roman"/>
-          <w:sz w:val="24"/>
-        </w:rPr>
-        <w:br/>
-      </w:r>
-      <w:r>
-        <w:rPr>
-          <w:rStyle w:val="VerbatimChar"/>
-          <w:rFonts w:ascii="Times New Roman" w:hAnsi="Times New Roman"/>
-          <w:sz w:val="24"/>
-        </w:rPr>
-        <w:t xml:space="preserve">  A. for loop</w:t>
-      </w:r>
-      <w:r>
-        <w:rPr>
-          <w:rFonts w:ascii="Times New Roman" w:hAnsi="Times New Roman"/>
-          <w:sz w:val="24"/>
-        </w:rPr>
-        <w:br/>
-      </w:r>
-      <w:r>
-        <w:rPr>
-          <w:rStyle w:val="VerbatimChar"/>
-          <w:rFonts w:ascii="Times New Roman" w:hAnsi="Times New Roman"/>
-          <w:sz w:val="24"/>
-        </w:rPr>
-        <w:t xml:space="preserve">  B. while loop</w:t>
-      </w:r>
-      <w:r>
-        <w:rPr>
-          <w:rFonts w:ascii="Times New Roman" w:hAnsi="Times New Roman"/>
-          <w:sz w:val="24"/>
-        </w:rPr>
-        <w:br/>
-      </w:r>
-      <w:r>
-        <w:rPr>
-          <w:rStyle w:val="VerbatimChar"/>
-          <w:rFonts w:ascii="Times New Roman" w:hAnsi="Times New Roman"/>
-          <w:sz w:val="24"/>
-        </w:rPr>
-        <w:t xml:space="preserve">  C. if-else</w:t>
-      </w:r>
-      <w:r>
-        <w:rPr>
-          <w:rFonts w:ascii="Times New Roman" w:hAnsi="Times New Roman"/>
-          <w:sz w:val="24"/>
-        </w:rPr>
-        <w:br/>
-      </w:r>
-      <w:r>
-        <w:rPr>
-          <w:rStyle w:val="VerbatimChar"/>
-          <w:rFonts w:ascii="Times New Roman" w:hAnsi="Times New Roman"/>
-          <w:sz w:val="24"/>
-        </w:rPr>
-        <w:t xml:space="preserve">  D. switch</w:t>
-      </w:r>
-      <w:r>
-        <w:rPr>
-          <w:rFonts w:ascii="Times New Roman" w:hAnsi="Times New Roman"/>
-          <w:sz w:val="24"/>
-        </w:rPr>
-        <w:br/>
-      </w:r>
-      <w:r>
-        <w:rPr>
-          <w:rStyle w:val="VerbatimChar"/>
-          <w:rFonts w:ascii="Times New Roman" w:hAnsi="Times New Roman"/>
-          <w:sz w:val="24"/>
-        </w:rPr>
-        <w:t xml:space="preserve">Your answer: D</w:t>
-      </w:r>
-      <w:r>
-        <w:rPr>
-          <w:rFonts w:ascii="Times New Roman" w:hAnsi="Times New Roman"/>
-          <w:sz w:val="24"/>
-        </w:rPr>
-        <w:br/>
-      </w:r>
-      <w:r>
-        <w:rPr>
-          <w:rStyle w:val="VerbatimChar"/>
-          <w:rFonts w:ascii="Times New Roman" w:hAnsi="Times New Roman"/>
-          <w:sz w:val="24"/>
-        </w:rPr>
-        <w:t xml:space="preserve">Correct! switch is designed to test one expression against multiple constant values.</w:t>
-      </w:r>
-      <w:r>
-        <w:rPr>
-          <w:rFonts w:ascii="Times New Roman" w:hAnsi="Times New Roman"/>
-          <w:sz w:val="24"/>
-        </w:rPr>
-        <w:br/>
-      </w:r>
-      <w:r>
-        <w:rPr>
-          <w:rFonts w:ascii="Times New Roman" w:hAnsi="Times New Roman"/>
-          <w:sz w:val="24"/>
-        </w:rPr>
-        <w:br/>
-      </w:r>
-      <w:r>
-        <w:rPr>
-          <w:rStyle w:val="VerbatimChar"/>
-          <w:rFonts w:ascii="Times New Roman" w:hAnsi="Times New Roman"/>
-          <w:sz w:val="24"/>
-        </w:rPr>
-        <w:t xml:space="preserve">============================================</w:t>
-      </w:r>
-      <w:r>
-        <w:rPr>
-          <w:rFonts w:ascii="Times New Roman" w:hAnsi="Times New Roman"/>
-          <w:sz w:val="24"/>
-        </w:rPr>
-        <w:br/>
-      </w:r>
-      <w:r>
-        <w:rPr>
-          <w:rStyle w:val="VerbatimChar"/>
-          <w:rFonts w:ascii="Times New Roman" w:hAnsi="Times New Roman"/>
-          <w:sz w:val="24"/>
-        </w:rPr>
-        <w:t xml:space="preserve">              Quiz Complete!</w:t>
-      </w:r>
-      <w:r>
-        <w:rPr>
-          <w:rFonts w:ascii="Times New Roman" w:hAnsi="Times New Roman"/>
-          <w:sz w:val="24"/>
-        </w:rPr>
-        <w:br/>
-      </w:r>
-      <w:r>
-        <w:rPr>
-          <w:rStyle w:val="VerbatimChar"/>
-          <w:rFonts w:ascii="Times New Roman" w:hAnsi="Times New Roman"/>
-          <w:sz w:val="24"/>
-        </w:rPr>
-        <w:t xml:space="preserve">============================================</w:t>
-      </w:r>
-      <w:r>
-        <w:rPr>
-          <w:rFonts w:ascii="Times New Roman" w:hAnsi="Times New Roman"/>
-          <w:sz w:val="24"/>
-        </w:rPr>
-        <w:br/>
-      </w:r>
-      <w:r>
-        <w:rPr>
-          <w:rStyle w:val="VerbatimChar"/>
-          <w:rFonts w:ascii="Times New Roman" w:hAnsi="Times New Roman"/>
-          <w:sz w:val="24"/>
-        </w:rPr>
-        <w:t xml:space="preserve">You answered 5 out of 5 questions correctly.</w:t>
-      </w:r>
-      <w:r>
-        <w:rPr>
-          <w:rFonts w:ascii="Times New Roman" w:hAnsi="Times New Roman"/>
-          <w:sz w:val="24"/>
-        </w:rPr>
-        <w:br/>
-      </w:r>
-      <w:r>
-        <w:rPr>
-          <w:rStyle w:val="VerbatimChar"/>
-          <w:rFonts w:ascii="Times New Roman" w:hAnsi="Times New Roman"/>
-          <w:sz w:val="24"/>
-        </w:rPr>
-        <w:t xml:space="preserve">Your final score: 100.0%</w:t>
-      </w:r>
-      <w:r>
-        <w:rPr>
-          <w:rFonts w:ascii="Times New Roman" w:hAnsi="Times New Roman"/>
-          <w:sz w:val="24"/>
-        </w:rPr>
-        <w:br/>
-      </w:r>
-      <w:r>
-        <w:rPr>
-          <w:rFonts w:ascii="Times New Roman" w:hAnsi="Times New Roman"/>
-          <w:sz w:val="24"/>
-        </w:rPr>
-        <w:br/>
-      </w:r>
-      <w:r>
-        <w:rPr>
-          <w:rStyle w:val="VerbatimChar"/>
-          <w:rFonts w:ascii="Times New Roman" w:hAnsi="Times New Roman"/>
-          <w:sz w:val="24"/>
-        </w:rPr>
-        <w:t xml:space="preserve">Outstanding! You achieved a perfect score.</w:t>
-      </w:r>
-    </w:p>
-    <w:bookmarkEnd w:id="16"/>
-    <w:bookmarkStart w:id="17" w:name="test-run-2-all-wrong-answers-a-a-a-a-a"/>
-    <w:p>
-      <w:pPr>
-        <w:pStyle w:val="Heading3"/>
-        <w:spacing w:line="480" w:lineRule="exact" w:after="0"/>
-      </w:pPr>
-      <w:r>
-        <w:rPr>
-          <w:rFonts w:ascii="Times New Roman" w:hAnsi="Times New Roman"/>
-          <w:sz w:val="24"/>
-        </w:rPr>
-        <w:t xml:space="preserve">Test Run 2 — All Wrong Answers (A, A, A, A, A)</w:t>
-      </w:r>
-    </w:p>
-    <w:p>
-      <w:pPr>
-        <w:pStyle w:val="SourceCode"/>
-        <w:spacing w:line="480" w:lineRule="exact" w:after="0"/>
-      </w:pPr>
-      <w:r>
-        <w:rPr>
-          <w:rStyle w:val="VerbatimChar"/>
-          <w:rFonts w:ascii="Times New Roman" w:hAnsi="Times New Roman"/>
-          <w:sz w:val="24"/>
-        </w:rPr>
-        <w:t xml:space="preserve">============================================</w:t>
-      </w:r>
-      <w:r>
-        <w:rPr>
-          <w:rFonts w:ascii="Times New Roman" w:hAnsi="Times New Roman"/>
-          <w:sz w:val="24"/>
-        </w:rPr>
-        <w:br/>
-      </w:r>
-      <w:r>
-        <w:rPr>
-          <w:rStyle w:val="VerbatimChar"/>
-          <w:rFonts w:ascii="Times New Roman" w:hAnsi="Times New Roman"/>
-          <w:sz w:val="24"/>
-        </w:rPr>
-        <w:t xml:space="preserve">        Welcome to the Java Quiz Game</w:t>
-      </w:r>
-      <w:r>
-        <w:rPr>
-          <w:rFonts w:ascii="Times New Roman" w:hAnsi="Times New Roman"/>
-          <w:sz w:val="24"/>
-        </w:rPr>
-        <w:br/>
-      </w:r>
-      <w:r>
-        <w:rPr>
-          <w:rStyle w:val="VerbatimChar"/>
-          <w:rFonts w:ascii="Times New Roman" w:hAnsi="Times New Roman"/>
-          <w:sz w:val="24"/>
-        </w:rPr>
-        <w:t xml:space="preserve">============================================</w:t>
-      </w:r>
-      <w:r>
-        <w:rPr>
-          <w:rFonts w:ascii="Times New Roman" w:hAnsi="Times New Roman"/>
-          <w:sz w:val="24"/>
-        </w:rPr>
-        <w:br/>
-      </w:r>
-      <w:r>
-        <w:rPr>
-          <w:rStyle w:val="VerbatimChar"/>
-          <w:rFonts w:ascii="Times New Roman" w:hAnsi="Times New Roman"/>
-          <w:sz w:val="24"/>
-        </w:rPr>
-        <w:t xml:space="preserve">Type A, B, C, or D to answer each question.</w:t>
-      </w:r>
-      <w:r>
-        <w:rPr>
-          <w:rFonts w:ascii="Times New Roman" w:hAnsi="Times New Roman"/>
-          <w:sz w:val="24"/>
-        </w:rPr>
-        <w:br/>
-      </w:r>
-      <w:r>
-        <w:rPr>
-          <w:rFonts w:ascii="Times New Roman" w:hAnsi="Times New Roman"/>
-          <w:sz w:val="24"/>
-        </w:rPr>
-        <w:br/>
-      </w:r>
-      <w:r>
-        <w:rPr>
-          <w:rStyle w:val="VerbatimChar"/>
-          <w:rFonts w:ascii="Times New Roman" w:hAnsi="Times New Roman"/>
-          <w:sz w:val="24"/>
-        </w:rPr>
-        <w:t xml:space="preserve">Question 1: ...</w:t>
-      </w:r>
-      <w:r>
-        <w:rPr>
-          <w:rFonts w:ascii="Times New Roman" w:hAnsi="Times New Roman"/>
-          <w:sz w:val="24"/>
-        </w:rPr>
-        <w:br/>
-      </w:r>
-      <w:r>
-        <w:rPr>
-          <w:rStyle w:val="VerbatimChar"/>
-          <w:rFonts w:ascii="Times New Roman" w:hAnsi="Times New Roman"/>
-          <w:sz w:val="24"/>
-        </w:rPr>
-        <w:t xml:space="preserve">Your answer: A</w:t>
-      </w:r>
-      <w:r>
-        <w:rPr>
-          <w:rFonts w:ascii="Times New Roman" w:hAnsi="Times New Roman"/>
-          <w:sz w:val="24"/>
-        </w:rPr>
-        <w:br/>
-      </w:r>
-      <w:r>
-        <w:rPr>
-          <w:rStyle w:val="VerbatimChar"/>
-          <w:rFonts w:ascii="Times New Roman" w:hAnsi="Times New Roman"/>
-          <w:sz w:val="24"/>
-        </w:rPr>
-        <w:t xml:space="preserve">Incorrect. 'define' is not a Java keyword. The correct answer is B.</w:t>
-      </w:r>
-      <w:r>
-        <w:rPr>
-          <w:rFonts w:ascii="Times New Roman" w:hAnsi="Times New Roman"/>
-          <w:sz w:val="24"/>
-        </w:rPr>
-        <w:br/>
-      </w:r>
-      <w:r>
-        <w:rPr>
-          <w:rFonts w:ascii="Times New Roman" w:hAnsi="Times New Roman"/>
-          <w:sz w:val="24"/>
-        </w:rPr>
-        <w:br/>
-      </w:r>
-      <w:r>
-        <w:rPr>
-          <w:rStyle w:val="VerbatimChar"/>
-          <w:rFonts w:ascii="Times New Roman" w:hAnsi="Times New Roman"/>
-          <w:sz w:val="24"/>
-        </w:rPr>
-        <w:t xml:space="preserve">Question 2: ...</w:t>
-      </w:r>
-      <w:r>
-        <w:rPr>
-          <w:rFonts w:ascii="Times New Roman" w:hAnsi="Times New Roman"/>
-          <w:sz w:val="24"/>
-        </w:rPr>
-        <w:br/>
-      </w:r>
-      <w:r>
-        <w:rPr>
-          <w:rStyle w:val="VerbatimChar"/>
-          <w:rFonts w:ascii="Times New Roman" w:hAnsi="Times New Roman"/>
-          <w:sz w:val="24"/>
-        </w:rPr>
-        <w:t xml:space="preserve">Your answer: A</w:t>
-      </w:r>
-      <w:r>
-        <w:rPr>
-          <w:rFonts w:ascii="Times New Roman" w:hAnsi="Times New Roman"/>
-          <w:sz w:val="24"/>
-        </w:rPr>
-        <w:br/>
-      </w:r>
-      <w:r>
-        <w:rPr>
-          <w:rStyle w:val="VerbatimChar"/>
-          <w:rFonts w:ascii="Times New Roman" w:hAnsi="Times New Roman"/>
-          <w:sz w:val="24"/>
-        </w:rPr>
-        <w:t xml:space="preserve">Incorrect. 'null' is the default for reference types, not int. The correct answer is C.</w:t>
-      </w:r>
-      <w:r>
-        <w:rPr>
-          <w:rFonts w:ascii="Times New Roman" w:hAnsi="Times New Roman"/>
-          <w:sz w:val="24"/>
-        </w:rPr>
-        <w:br/>
-      </w:r>
-      <w:r>
-        <w:rPr>
-          <w:rFonts w:ascii="Times New Roman" w:hAnsi="Times New Roman"/>
-          <w:sz w:val="24"/>
-        </w:rPr>
-        <w:br/>
-      </w:r>
-      <w:r>
-        <w:rPr>
-          <w:rStyle w:val="VerbatimChar"/>
-          <w:rFonts w:ascii="Times New Roman" w:hAnsi="Times New Roman"/>
-          <w:sz w:val="24"/>
-        </w:rPr>
-        <w:t xml:space="preserve">Question 3: ...</w:t>
-      </w:r>
-      <w:r>
-        <w:rPr>
-          <w:rFonts w:ascii="Times New Roman" w:hAnsi="Times New Roman"/>
-          <w:sz w:val="24"/>
-        </w:rPr>
-        <w:br/>
-      </w:r>
-      <w:r>
-        <w:rPr>
-          <w:rStyle w:val="VerbatimChar"/>
-          <w:rFonts w:ascii="Times New Roman" w:hAnsi="Times New Roman"/>
-          <w:sz w:val="24"/>
-        </w:rPr>
-        <w:t xml:space="preserve">Your answer: A</w:t>
-      </w:r>
-      <w:r>
-        <w:rPr>
-          <w:rFonts w:ascii="Times New Roman" w:hAnsi="Times New Roman"/>
-          <w:sz w:val="24"/>
-        </w:rPr>
-        <w:br/>
-      </w:r>
-      <w:r>
-        <w:rPr>
-          <w:rStyle w:val="VerbatimChar"/>
-          <w:rFonts w:ascii="Times New Roman" w:hAnsi="Times New Roman"/>
-          <w:sz w:val="24"/>
-        </w:rPr>
-        <w:t xml:space="preserve">Incorrect. String is a reference type (a class), not a primitive. The correct answer is C.</w:t>
-      </w:r>
-      <w:r>
-        <w:rPr>
-          <w:rFonts w:ascii="Times New Roman" w:hAnsi="Times New Roman"/>
-          <w:sz w:val="24"/>
-        </w:rPr>
-        <w:br/>
-      </w:r>
-      <w:r>
-        <w:rPr>
-          <w:rFonts w:ascii="Times New Roman" w:hAnsi="Times New Roman"/>
-          <w:sz w:val="24"/>
-        </w:rPr>
-        <w:br/>
-      </w:r>
-      <w:r>
-        <w:rPr>
-          <w:rStyle w:val="VerbatimChar"/>
-          <w:rFonts w:ascii="Times New Roman" w:hAnsi="Times New Roman"/>
-          <w:sz w:val="24"/>
-        </w:rPr>
-        <w:t xml:space="preserve">Question 4: ...</w:t>
-      </w:r>
-      <w:r>
-        <w:rPr>
-          <w:rFonts w:ascii="Times New Roman" w:hAnsi="Times New Roman"/>
-          <w:sz w:val="24"/>
-        </w:rPr>
-        <w:br/>
-      </w:r>
-      <w:r>
-        <w:rPr>
-          <w:rStyle w:val="VerbatimChar"/>
-          <w:rFonts w:ascii="Times New Roman" w:hAnsi="Times New Roman"/>
-          <w:sz w:val="24"/>
-        </w:rPr>
-        <w:t xml:space="preserve">Your answer: A</w:t>
-      </w:r>
-      <w:r>
-        <w:rPr>
-          <w:rFonts w:ascii="Times New Roman" w:hAnsi="Times New Roman"/>
-          <w:sz w:val="24"/>
-        </w:rPr>
-        <w:br/>
-      </w:r>
-      <w:r>
-        <w:rPr>
-          <w:rStyle w:val="VerbatimChar"/>
-          <w:rFonts w:ascii="Times New Roman" w:hAnsi="Times New Roman"/>
-          <w:sz w:val="24"/>
-        </w:rPr>
-        <w:t xml:space="preserve">Incorrect. Division is performed by /. The correct answer is B.</w:t>
-      </w:r>
-      <w:r>
-        <w:rPr>
-          <w:rFonts w:ascii="Times New Roman" w:hAnsi="Times New Roman"/>
-          <w:sz w:val="24"/>
-        </w:rPr>
-        <w:br/>
-      </w:r>
-      <w:r>
-        <w:rPr>
-          <w:rFonts w:ascii="Times New Roman" w:hAnsi="Times New Roman"/>
-          <w:sz w:val="24"/>
-        </w:rPr>
-        <w:br/>
-      </w:r>
-      <w:r>
-        <w:rPr>
-          <w:rStyle w:val="VerbatimChar"/>
-          <w:rFonts w:ascii="Times New Roman" w:hAnsi="Times New Roman"/>
-          <w:sz w:val="24"/>
-        </w:rPr>
-        <w:t xml:space="preserve">Question 5: ...</w:t>
-      </w:r>
-      <w:r>
-        <w:rPr>
-          <w:rFonts w:ascii="Times New Roman" w:hAnsi="Times New Roman"/>
-          <w:sz w:val="24"/>
-        </w:rPr>
-        <w:br/>
-      </w:r>
-      <w:r>
-        <w:rPr>
-          <w:rStyle w:val="VerbatimChar"/>
-          <w:rFonts w:ascii="Times New Roman" w:hAnsi="Times New Roman"/>
-          <w:sz w:val="24"/>
-        </w:rPr>
-        <w:t xml:space="preserve">Your answer: A</w:t>
-      </w:r>
-      <w:r>
-        <w:rPr>
-          <w:rFonts w:ascii="Times New Roman" w:hAnsi="Times New Roman"/>
-          <w:sz w:val="24"/>
-        </w:rPr>
-        <w:br/>
-      </w:r>
-      <w:r>
-        <w:rPr>
-          <w:rStyle w:val="VerbatimChar"/>
-          <w:rFonts w:ascii="Times New Roman" w:hAnsi="Times New Roman"/>
-          <w:sz w:val="24"/>
-        </w:rPr>
-        <w:t xml:space="preserve">Incorrect. A for loop is used for iteration, not value matching. The correct answer is D.</w:t>
-      </w:r>
-      <w:r>
-        <w:rPr>
-          <w:rFonts w:ascii="Times New Roman" w:hAnsi="Times New Roman"/>
-          <w:sz w:val="24"/>
-        </w:rPr>
-        <w:br/>
-      </w:r>
-      <w:r>
-        <w:rPr>
-          <w:rFonts w:ascii="Times New Roman" w:hAnsi="Times New Roman"/>
-          <w:sz w:val="24"/>
-        </w:rPr>
-        <w:br/>
-      </w:r>
-      <w:r>
-        <w:rPr>
-          <w:rStyle w:val="VerbatimChar"/>
-          <w:rFonts w:ascii="Times New Roman" w:hAnsi="Times New Roman"/>
-          <w:sz w:val="24"/>
-        </w:rPr>
-        <w:t xml:space="preserve">============================================</w:t>
-      </w:r>
-      <w:r>
-        <w:rPr>
-          <w:rFonts w:ascii="Times New Roman" w:hAnsi="Times New Roman"/>
-          <w:sz w:val="24"/>
-        </w:rPr>
-        <w:br/>
-      </w:r>
-      <w:r>
-        <w:rPr>
-          <w:rStyle w:val="VerbatimChar"/>
-          <w:rFonts w:ascii="Times New Roman" w:hAnsi="Times New Roman"/>
-          <w:sz w:val="24"/>
-        </w:rPr>
-        <w:t xml:space="preserve">              Quiz Complete!</w:t>
-      </w:r>
-      <w:r>
-        <w:rPr>
-          <w:rFonts w:ascii="Times New Roman" w:hAnsi="Times New Roman"/>
-          <w:sz w:val="24"/>
-        </w:rPr>
-        <w:br/>
-      </w:r>
-      <w:r>
-        <w:rPr>
-          <w:rStyle w:val="VerbatimChar"/>
-          <w:rFonts w:ascii="Times New Roman" w:hAnsi="Times New Roman"/>
-          <w:sz w:val="24"/>
-        </w:rPr>
-        <w:t xml:space="preserve">============================================</w:t>
-      </w:r>
-      <w:r>
-        <w:rPr>
-          <w:rFonts w:ascii="Times New Roman" w:hAnsi="Times New Roman"/>
-          <w:sz w:val="24"/>
-        </w:rPr>
-        <w:br/>
-      </w:r>
-      <w:r>
-        <w:rPr>
-          <w:rStyle w:val="VerbatimChar"/>
-          <w:rFonts w:ascii="Times New Roman" w:hAnsi="Times New Roman"/>
-          <w:sz w:val="24"/>
-        </w:rPr>
-        <w:t xml:space="preserve">You answered 0 out of 5 questions correctly.</w:t>
-      </w:r>
-      <w:r>
-        <w:rPr>
-          <w:rFonts w:ascii="Times New Roman" w:hAnsi="Times New Roman"/>
-          <w:sz w:val="24"/>
-        </w:rPr>
-        <w:br/>
-      </w:r>
-      <w:r>
-        <w:rPr>
-          <w:rStyle w:val="VerbatimChar"/>
-          <w:rFonts w:ascii="Times New Roman" w:hAnsi="Times New Roman"/>
-          <w:sz w:val="24"/>
-        </w:rPr>
-        <w:t xml:space="preserve">Your final score: 0.0%</w:t>
-      </w:r>
-      <w:r>
-        <w:rPr>
-          <w:rFonts w:ascii="Times New Roman" w:hAnsi="Times New Roman"/>
-          <w:sz w:val="24"/>
-        </w:rPr>
-        <w:br/>
-      </w:r>
-      <w:r>
-        <w:rPr>
-          <w:rFonts w:ascii="Times New Roman" w:hAnsi="Times New Roman"/>
-          <w:sz w:val="24"/>
-        </w:rPr>
-        <w:br/>
-      </w:r>
-      <w:r>
-        <w:rPr>
-          <w:rStyle w:val="VerbatimChar"/>
-          <w:rFonts w:ascii="Times New Roman" w:hAnsi="Times New Roman"/>
-          <w:sz w:val="24"/>
-        </w:rPr>
-        <w:t xml:space="preserve">Keep studying — revisit Chapter 2 and 3 of Eck (2022) for review.</w:t>
-      </w:r>
-    </w:p>
-    <w:bookmarkEnd w:id="17"/>
-    <w:bookmarkStart w:id="18" w:name="Xf45064cc7ada51a571a634aa85d950a71f5ade3"/>
-    <w:p>
-      <w:pPr>
-        <w:pStyle w:val="Heading3"/>
-        <w:spacing w:line="480" w:lineRule="exact" w:after="0"/>
-      </w:pPr>
-      <w:r>
-        <w:rPr>
-          <w:rFonts w:ascii="Times New Roman" w:hAnsi="Times New Roman"/>
-          <w:sz w:val="24"/>
-        </w:rPr>
-        <w:t xml:space="preserve">Test Run 3 — Invalid Input on Question 1, then Mixed Answers (X, B, C, B, D)</w:t>
-      </w:r>
-    </w:p>
-    <w:p>
-      <w:pPr>
-        <w:pStyle w:val="SourceCode"/>
-        <w:spacing w:line="480" w:lineRule="exact" w:after="0"/>
-      </w:pPr>
-      <w:r>
-        <w:rPr>
-          <w:rStyle w:val="VerbatimChar"/>
-          <w:rFonts w:ascii="Times New Roman" w:hAnsi="Times New Roman"/>
-          <w:sz w:val="24"/>
-        </w:rPr>
-        <w:t xml:space="preserve">Question 1: ...</w:t>
-      </w:r>
-      <w:r>
-        <w:rPr>
-          <w:rFonts w:ascii="Times New Roman" w:hAnsi="Times New Roman"/>
-          <w:sz w:val="24"/>
-        </w:rPr>
-        <w:br/>
-      </w:r>
-      <w:r>
-        <w:rPr>
-          <w:rStyle w:val="VerbatimChar"/>
-          <w:rFonts w:ascii="Times New Roman" w:hAnsi="Times New Roman"/>
-          <w:sz w:val="24"/>
-        </w:rPr>
-        <w:t xml:space="preserve">Your answer: X</w:t>
-      </w:r>
-      <w:r>
-        <w:rPr>
-          <w:rFonts w:ascii="Times New Roman" w:hAnsi="Times New Roman"/>
-          <w:sz w:val="24"/>
-        </w:rPr>
-        <w:br/>
-      </w:r>
-      <w:r>
-        <w:rPr>
-          <w:rStyle w:val="VerbatimChar"/>
-          <w:rFonts w:ascii="Times New Roman" w:hAnsi="Times New Roman"/>
-          <w:sz w:val="24"/>
-        </w:rPr>
-        <w:t xml:space="preserve">Invalid input 'X'. Please enter A, B, C, or D. Question skipped.</w:t>
-      </w:r>
-      <w:r>
-        <w:rPr>
-          <w:rFonts w:ascii="Times New Roman" w:hAnsi="Times New Roman"/>
-          <w:sz w:val="24"/>
-        </w:rPr>
-        <w:br/>
-      </w:r>
-      <w:r>
-        <w:rPr>
-          <w:rFonts w:ascii="Times New Roman" w:hAnsi="Times New Roman"/>
-          <w:sz w:val="24"/>
-        </w:rPr>
-        <w:br/>
-      </w:r>
-      <w:r>
-        <w:rPr>
-          <w:rStyle w:val="VerbatimChar"/>
-          <w:rFonts w:ascii="Times New Roman" w:hAnsi="Times New Roman"/>
-          <w:sz w:val="24"/>
-        </w:rPr>
-        <w:t xml:space="preserve">Question 2: ...</w:t>
-      </w:r>
-      <w:r>
-        <w:rPr>
-          <w:rFonts w:ascii="Times New Roman" w:hAnsi="Times New Roman"/>
-          <w:sz w:val="24"/>
-        </w:rPr>
-        <w:br/>
-      </w:r>
-      <w:r>
-        <w:rPr>
-          <w:rStyle w:val="VerbatimChar"/>
-          <w:rFonts w:ascii="Times New Roman" w:hAnsi="Times New Roman"/>
-          <w:sz w:val="24"/>
-        </w:rPr>
-        <w:t xml:space="preserve">Your answer: B</w:t>
-      </w:r>
-      <w:r>
-        <w:rPr>
-          <w:rFonts w:ascii="Times New Roman" w:hAnsi="Times New Roman"/>
-          <w:sz w:val="24"/>
-        </w:rPr>
-        <w:br/>
-      </w:r>
-      <w:r>
-        <w:rPr>
-          <w:rStyle w:val="VerbatimChar"/>
-          <w:rFonts w:ascii="Times New Roman" w:hAnsi="Times New Roman"/>
-          <w:sz w:val="24"/>
-        </w:rPr>
-        <w:t xml:space="preserve">Incorrect. int variables do not default to 1. The correct answer is C.</w:t>
-      </w:r>
-      <w:r>
-        <w:rPr>
-          <w:rFonts w:ascii="Times New Roman" w:hAnsi="Times New Roman"/>
-          <w:sz w:val="24"/>
-        </w:rPr>
-        <w:br/>
-      </w:r>
-      <w:r>
-        <w:rPr>
-          <w:rFonts w:ascii="Times New Roman" w:hAnsi="Times New Roman"/>
-          <w:sz w:val="24"/>
-        </w:rPr>
-        <w:br/>
-      </w:r>
-      <w:r>
-        <w:rPr>
-          <w:rStyle w:val="VerbatimChar"/>
-          <w:rFonts w:ascii="Times New Roman" w:hAnsi="Times New Roman"/>
-          <w:sz w:val="24"/>
-        </w:rPr>
-        <w:t xml:space="preserve">Question 3: ...</w:t>
-      </w:r>
-      <w:r>
-        <w:rPr>
-          <w:rFonts w:ascii="Times New Roman" w:hAnsi="Times New Roman"/>
-          <w:sz w:val="24"/>
-        </w:rPr>
-        <w:br/>
-      </w:r>
-      <w:r>
-        <w:rPr>
-          <w:rStyle w:val="VerbatimChar"/>
-          <w:rFonts w:ascii="Times New Roman" w:hAnsi="Times New Roman"/>
-          <w:sz w:val="24"/>
-        </w:rPr>
-        <w:t xml:space="preserve">Your answer: C</w:t>
-      </w:r>
-      <w:r>
-        <w:rPr>
-          <w:rFonts w:ascii="Times New Roman" w:hAnsi="Times New Roman"/>
-          <w:sz w:val="24"/>
-        </w:rPr>
-        <w:br/>
-      </w:r>
-      <w:r>
-        <w:rPr>
-          <w:rStyle w:val="VerbatimChar"/>
-          <w:rFonts w:ascii="Times New Roman" w:hAnsi="Times New Roman"/>
-          <w:sz w:val="24"/>
-        </w:rPr>
-        <w:t xml:space="preserve">Correct! 'double' is one of Java's eight primitive data types.</w:t>
-      </w:r>
-      <w:r>
-        <w:rPr>
-          <w:rFonts w:ascii="Times New Roman" w:hAnsi="Times New Roman"/>
-          <w:sz w:val="24"/>
-        </w:rPr>
-        <w:br/>
-      </w:r>
-      <w:r>
-        <w:rPr>
-          <w:rFonts w:ascii="Times New Roman" w:hAnsi="Times New Roman"/>
-          <w:sz w:val="24"/>
-        </w:rPr>
-        <w:br/>
-      </w:r>
-      <w:r>
-        <w:rPr>
-          <w:rStyle w:val="VerbatimChar"/>
-          <w:rFonts w:ascii="Times New Roman" w:hAnsi="Times New Roman"/>
-          <w:sz w:val="24"/>
-        </w:rPr>
-        <w:t xml:space="preserve">Question 4: ...</w:t>
-      </w:r>
-      <w:r>
-        <w:rPr>
-          <w:rFonts w:ascii="Times New Roman" w:hAnsi="Times New Roman"/>
-          <w:sz w:val="24"/>
-        </w:rPr>
-        <w:br/>
-      </w:r>
-      <w:r>
-        <w:rPr>
-          <w:rStyle w:val="VerbatimChar"/>
-          <w:rFonts w:ascii="Times New Roman" w:hAnsi="Times New Roman"/>
-          <w:sz w:val="24"/>
-        </w:rPr>
-        <w:t xml:space="preserve">Your answer: B</w:t>
-      </w:r>
-      <w:r>
-        <w:rPr>
-          <w:rFonts w:ascii="Times New Roman" w:hAnsi="Times New Roman"/>
-          <w:sz w:val="24"/>
-        </w:rPr>
-        <w:br/>
-      </w:r>
-      <w:r>
-        <w:rPr>
-          <w:rStyle w:val="VerbatimChar"/>
-          <w:rFonts w:ascii="Times New Roman" w:hAnsi="Times New Roman"/>
-          <w:sz w:val="24"/>
-        </w:rPr>
-        <w:t xml:space="preserve">Correct! % is the modulo operator; it returns the remainder of division.</w:t>
-      </w:r>
-      <w:r>
-        <w:rPr>
-          <w:rFonts w:ascii="Times New Roman" w:hAnsi="Times New Roman"/>
-          <w:sz w:val="24"/>
-        </w:rPr>
-        <w:br/>
-      </w:r>
-      <w:r>
-        <w:rPr>
-          <w:rFonts w:ascii="Times New Roman" w:hAnsi="Times New Roman"/>
-          <w:sz w:val="24"/>
-        </w:rPr>
-        <w:br/>
-      </w:r>
-      <w:r>
-        <w:rPr>
-          <w:rStyle w:val="VerbatimChar"/>
-          <w:rFonts w:ascii="Times New Roman" w:hAnsi="Times New Roman"/>
-          <w:sz w:val="24"/>
-        </w:rPr>
-        <w:t xml:space="preserve">Question 5: ...</w:t>
-      </w:r>
-      <w:r>
-        <w:rPr>
-          <w:rFonts w:ascii="Times New Roman" w:hAnsi="Times New Roman"/>
-          <w:sz w:val="24"/>
-        </w:rPr>
-        <w:br/>
-      </w:r>
-      <w:r>
-        <w:rPr>
-          <w:rStyle w:val="VerbatimChar"/>
-          <w:rFonts w:ascii="Times New Roman" w:hAnsi="Times New Roman"/>
-          <w:sz w:val="24"/>
-        </w:rPr>
-        <w:t xml:space="preserve">Your answer: D</w:t>
-      </w:r>
-      <w:r>
-        <w:rPr>
-          <w:rFonts w:ascii="Times New Roman" w:hAnsi="Times New Roman"/>
-          <w:sz w:val="24"/>
-        </w:rPr>
-        <w:br/>
-      </w:r>
-      <w:r>
-        <w:rPr>
-          <w:rStyle w:val="VerbatimChar"/>
-          <w:rFonts w:ascii="Times New Roman" w:hAnsi="Times New Roman"/>
-          <w:sz w:val="24"/>
-        </w:rPr>
-        <w:t xml:space="preserve">Correct! switch is designed to test one expression against multiple constant values.</w:t>
-      </w:r>
-      <w:r>
-        <w:rPr>
-          <w:rFonts w:ascii="Times New Roman" w:hAnsi="Times New Roman"/>
-          <w:sz w:val="24"/>
-        </w:rPr>
-        <w:br/>
-      </w:r>
-      <w:r>
-        <w:rPr>
-          <w:rFonts w:ascii="Times New Roman" w:hAnsi="Times New Roman"/>
-          <w:sz w:val="24"/>
-        </w:rPr>
-        <w:br/>
-      </w:r>
-      <w:r>
-        <w:rPr>
-          <w:rStyle w:val="VerbatimChar"/>
-          <w:rFonts w:ascii="Times New Roman" w:hAnsi="Times New Roman"/>
-          <w:sz w:val="24"/>
-        </w:rPr>
-        <w:t xml:space="preserve">============================================</w:t>
-      </w:r>
-      <w:r>
-        <w:rPr>
-          <w:rFonts w:ascii="Times New Roman" w:hAnsi="Times New Roman"/>
-          <w:sz w:val="24"/>
-        </w:rPr>
-        <w:br/>
-      </w:r>
-      <w:r>
-        <w:rPr>
-          <w:rStyle w:val="VerbatimChar"/>
-          <w:rFonts w:ascii="Times New Roman" w:hAnsi="Times New Roman"/>
-          <w:sz w:val="24"/>
-        </w:rPr>
-        <w:t xml:space="preserve">              Quiz Complete!</w:t>
-      </w:r>
-      <w:r>
-        <w:rPr>
-          <w:rFonts w:ascii="Times New Roman" w:hAnsi="Times New Roman"/>
-          <w:sz w:val="24"/>
-        </w:rPr>
-        <w:br/>
-      </w:r>
-      <w:r>
-        <w:rPr>
-          <w:rStyle w:val="VerbatimChar"/>
-          <w:rFonts w:ascii="Times New Roman" w:hAnsi="Times New Roman"/>
-          <w:sz w:val="24"/>
-        </w:rPr>
-        <w:t xml:space="preserve">============================================</w:t>
-      </w:r>
-      <w:r>
-        <w:rPr>
-          <w:rFonts w:ascii="Times New Roman" w:hAnsi="Times New Roman"/>
-          <w:sz w:val="24"/>
-        </w:rPr>
-        <w:br/>
-      </w:r>
-      <w:r>
-        <w:rPr>
-          <w:rStyle w:val="VerbatimChar"/>
-          <w:rFonts w:ascii="Times New Roman" w:hAnsi="Times New Roman"/>
-          <w:sz w:val="24"/>
-        </w:rPr>
-        <w:t xml:space="preserve">You answered 3 out of 5 questions correctly.</w:t>
-      </w:r>
-      <w:r>
-        <w:rPr>
-          <w:rFonts w:ascii="Times New Roman" w:hAnsi="Times New Roman"/>
-          <w:sz w:val="24"/>
-        </w:rPr>
-        <w:br/>
-      </w:r>
-      <w:r>
-        <w:rPr>
-          <w:rStyle w:val="VerbatimChar"/>
-          <w:rFonts w:ascii="Times New Roman" w:hAnsi="Times New Roman"/>
-          <w:sz w:val="24"/>
-        </w:rPr>
-        <w:t xml:space="preserve">Your final score: 60.0%</w:t>
-      </w:r>
-      <w:r>
-        <w:rPr>
-          <w:rFonts w:ascii="Times New Roman" w:hAnsi="Times New Roman"/>
-          <w:sz w:val="24"/>
-        </w:rPr>
-        <w:br/>
-      </w:r>
-      <w:r>
-        <w:rPr>
-          <w:rFonts w:ascii="Times New Roman" w:hAnsi="Times New Roman"/>
-          <w:sz w:val="24"/>
-        </w:rPr>
-        <w:br/>
-      </w:r>
-      <w:r>
-        <w:rPr>
-          <w:rStyle w:val="VerbatimChar"/>
-          <w:rFonts w:ascii="Times New Roman" w:hAnsi="Times New Roman"/>
-          <w:sz w:val="24"/>
-        </w:rPr>
-        <w:t xml:space="preserve">Good effort! Review the questions you missed and try again.</w:t>
-      </w:r>
-    </w:p>
-    <w:p>
-      <w:pPr>
-        <w:spacing w:line="480" w:lineRule="exact" w:after="0"/>
-      </w:pPr>
-      <w:r>
-        <w:rPr>
-          <w:rFonts w:ascii="Times New Roman" w:hAnsi="Times New Roman"/>
-          <w:sz w:val="24"/>
-        </w:rPr>
-        <w:pict>
-          <v:rect style="width:0;height:1.5pt" o:hralign="center" o:hrstd="t" o:hr="t"/>
-        </w:pict>
-      </w:r>
-    </w:p>
-    <w:bookmarkEnd w:id="18"/>
-    <w:bookmarkEnd w:id="19"/>
-    <w:bookmarkStart w:id="20" w:name="Xdab352a2c567ffa56a5eaaca28c02926b5292cc"/>
-    <w:p>
-      <w:pPr>
-        <w:pStyle w:val="Heading2"/>
-        <w:spacing w:line="480" w:lineRule="exact" w:after="0"/>
-      </w:pPr>
-      <w:r>
-        <w:rPr>
-          <w:rFonts w:ascii="Times New Roman" w:hAnsi="Times New Roman"/>
-          <w:sz w:val="24"/>
-        </w:rPr>
-        <w:t xml:space="preserve">8. Code Style and Readability (Rubric Criterion 6)</w:t>
+        <w:t xml:space="preserve">Screenshot 1 — IDE Screenshot (Code in IntelliJ IDEA)</w:t>
       </w:r>
     </w:p>
     <w:p>
@@ -18904,163 +17339,11 @@
       <w:r>
         <w:rPr>
           <w:rFonts w:ascii="Times New Roman" w:hAnsi="Times New Roman"/>
-          <w:sz w:val="24"/>
-        </w:rPr>
-        <w:t xml:space="preserve">The code follows consistent four-space indentation throughout. Every logical section — setup, each question, and score output — is separated by a clearly labeled comment block. Variable names are descriptive (</w:t>
-      </w:r>
-      <w:r>
-        <w:rPr>
-          <w:rStyle w:val="VerbatimChar"/>
-          <w:rFonts w:ascii="Times New Roman" w:hAnsi="Times New Roman"/>
-          <w:sz w:val="24"/>
-        </w:rPr>
-        <w:t xml:space="preserve">score</w:t>
-      </w:r>
-      <w:r>
-        <w:rPr>
-          <w:rFonts w:ascii="Times New Roman" w:hAnsi="Times New Roman"/>
-          <w:sz w:val="24"/>
-        </w:rPr>
-        <w:t xml:space="preserve">,</w:t>
-      </w:r>
-      <w:r>
-        <w:rPr>
-          <w:rFonts w:ascii="Times New Roman" w:hAnsi="Times New Roman"/>
-          <w:sz w:val="24"/>
-        </w:rPr>
-        <w:t xml:space="preserve"> </w:t>
-      </w:r>
-      <w:r>
-        <w:rPr>
-          <w:rStyle w:val="VerbatimChar"/>
-          <w:rFonts w:ascii="Times New Roman" w:hAnsi="Times New Roman"/>
-          <w:sz w:val="24"/>
-        </w:rPr>
-        <w:t xml:space="preserve">totalQuestions</w:t>
-      </w:r>
-      <w:r>
-        <w:rPr>
-          <w:rFonts w:ascii="Times New Roman" w:hAnsi="Times New Roman"/>
-          <w:sz w:val="24"/>
-        </w:rPr>
-        <w:t xml:space="preserve">,</w:t>
-      </w:r>
-      <w:r>
-        <w:rPr>
-          <w:rFonts w:ascii="Times New Roman" w:hAnsi="Times New Roman"/>
-          <w:sz w:val="24"/>
-        </w:rPr>
-        <w:t xml:space="preserve"> </w:t>
-      </w:r>
-      <w:r>
-        <w:rPr>
-          <w:rStyle w:val="VerbatimChar"/>
-          <w:rFonts w:ascii="Times New Roman" w:hAnsi="Times New Roman"/>
-          <w:sz w:val="24"/>
-        </w:rPr>
-        <w:t xml:space="preserve">percentage</w:t>
-      </w:r>
-      <w:r>
-        <w:rPr>
-          <w:rFonts w:ascii="Times New Roman" w:hAnsi="Times New Roman"/>
-          <w:sz w:val="24"/>
-        </w:rPr>
-        <w:t xml:space="preserve">,</w:t>
-      </w:r>
-      <w:r>
-        <w:rPr>
-          <w:rFonts w:ascii="Times New Roman" w:hAnsi="Times New Roman"/>
-          <w:sz w:val="24"/>
-        </w:rPr>
-        <w:t xml:space="preserve"> </w:t>
-      </w:r>
-      <w:r>
-        <w:rPr>
-          <w:rStyle w:val="VerbatimChar"/>
-          <w:rFonts w:ascii="Times New Roman" w:hAnsi="Times New Roman"/>
-          <w:sz w:val="24"/>
-        </w:rPr>
-        <w:t xml:space="preserve">ans1</w:t>
-      </w:r>
-      <w:r>
-        <w:rPr>
-          <w:rFonts w:ascii="Times New Roman" w:hAnsi="Times New Roman"/>
-          <w:sz w:val="24"/>
-        </w:rPr>
-        <w:t xml:space="preserve">–</w:t>
-      </w:r>
-      <w:r>
-        <w:rPr>
-          <w:rStyle w:val="VerbatimChar"/>
-          <w:rFonts w:ascii="Times New Roman" w:hAnsi="Times New Roman"/>
-          <w:sz w:val="24"/>
-        </w:rPr>
-        <w:t xml:space="preserve">ans5</w:t>
-      </w:r>
-      <w:r>
-        <w:rPr>
-          <w:rFonts w:ascii="Times New Roman" w:hAnsi="Times New Roman"/>
-          <w:sz w:val="24"/>
-        </w:rPr>
-        <w:t xml:space="preserve">) and follow Java’s camelCase convention (Eck, 2022, §2.2). There is no redundant or dead code. The</w:t>
-      </w:r>
-      <w:r>
-        <w:rPr>
-          <w:rFonts w:ascii="Times New Roman" w:hAnsi="Times New Roman"/>
-          <w:sz w:val="24"/>
-        </w:rPr>
-        <w:t xml:space="preserve"> </w:t>
-      </w:r>
-      <w:r>
-        <w:rPr>
-          <w:rStyle w:val="VerbatimChar"/>
-          <w:rFonts w:ascii="Times New Roman" w:hAnsi="Times New Roman"/>
-          <w:sz w:val="24"/>
-        </w:rPr>
-        <w:t xml:space="preserve">Scanner</w:t>
-      </w:r>
-      <w:r>
-        <w:rPr>
-          <w:rFonts w:ascii="Times New Roman" w:hAnsi="Times New Roman"/>
-          <w:sz w:val="24"/>
-        </w:rPr>
-        <w:t xml:space="preserve"> </w:t>
-      </w:r>
-      <w:r>
-        <w:rPr>
-          <w:rFonts w:ascii="Times New Roman" w:hAnsi="Times New Roman"/>
-          <w:sz w:val="24"/>
-        </w:rPr>
-        <w:t xml:space="preserve">is closed at the end of</w:t>
-      </w:r>
-      <w:r>
-        <w:rPr>
-          <w:rFonts w:ascii="Times New Roman" w:hAnsi="Times New Roman"/>
-          <w:sz w:val="24"/>
-        </w:rPr>
-        <w:t xml:space="preserve"> </w:t>
-      </w:r>
-      <w:r>
-        <w:rPr>
-          <w:rStyle w:val="VerbatimChar"/>
-          <w:rFonts w:ascii="Times New Roman" w:hAnsi="Times New Roman"/>
-          <w:sz w:val="24"/>
-        </w:rPr>
-        <w:t xml:space="preserve">main</w:t>
-      </w:r>
-      <w:r>
-        <w:rPr>
-          <w:rFonts w:ascii="Times New Roman" w:hAnsi="Times New Roman"/>
-          <w:sz w:val="24"/>
-        </w:rPr>
-        <w:t xml:space="preserve"> </w:t>
-      </w:r>
-      <w:r>
-        <w:rPr>
-          <w:rFonts w:ascii="Times New Roman" w:hAnsi="Times New Roman"/>
-          <w:sz w:val="24"/>
-        </w:rPr>
-        <w:t xml:space="preserve">to avoid a resource leak. The Javadoc comment at the top of the class documents the program’s purpose, flow, author, and course, making the code immediately understandable to any reader.</w:t>
+          <w:i/>
+          <w:iCs/>
+          <w:sz w:val="24"/>
+        </w:rPr>
+        <w:t xml:space="preserve">[INSERT SCREENSHOT HERE: IntelliJ IDEA editor showing the full QuizGame.java code. The screenshot should show the project structure panel on the left, the code in the editor, and the IntelliJ toolbar at the top.]</w:t>
       </w:r>
     </w:p>
     <w:p>
@@ -19077,11 +17360,11 @@
         </w:pict>
       </w:r>
     </w:p>
-    <w:bookmarkEnd w:id="20"/>
-    <w:bookmarkStart w:id="21" w:name="references"/>
+    <w:bookmarkEnd w:id="16"/>
+    <w:bookmarkStart w:id="17" w:name="Xe61b2c181f97420e250aefce61a771503023669"/>
     <w:p>
       <w:pPr>
-        <w:pStyle w:val="Heading2"/>
+        <w:pStyle w:val="Heading3"/>
         <w:spacing w:line="480" w:lineRule="exact" w:after="0"/>
       </w:pPr>
       <w:r>
@@ -19089,7 +17372,7 @@
           <w:rFonts w:ascii="Times New Roman" w:hAnsi="Times New Roman"/>
           <w:sz w:val="24"/>
         </w:rPr>
-        <w:t xml:space="preserve">References</w:t>
+        <w:t xml:space="preserve">Screenshot 2 — Output Screenshot: Test Run 1 (All Correct Answers — B, C, C, B, D)</w:t>
       </w:r>
     </w:p>
     <w:p>
@@ -19100,39 +17383,47 @@
       <w:r>
         <w:rPr>
           <w:rFonts w:ascii="Times New Roman" w:hAnsi="Times New Roman"/>
-          <w:sz w:val="24"/>
-        </w:rPr>
-        <w:t xml:space="preserve">Eck, D. J. (2022).</w:t>
-      </w:r>
-      <w:r>
-        <w:rPr>
-          <w:rFonts w:ascii="Times New Roman" w:hAnsi="Times New Roman"/>
-          <w:sz w:val="24"/>
-        </w:rPr>
-        <w:t xml:space="preserve"> </w:t>
-      </w:r>
-      <w:r>
-        <w:rPr>
-          <w:rFonts w:ascii="Times New Roman" w:hAnsi="Times New Roman"/>
           <w:i/>
           <w:iCs/>
           <w:sz w:val="24"/>
         </w:rPr>
-        <w:t xml:space="preserve">Introduction to programming using Java</w:t>
-      </w:r>
-      <w:r>
-        <w:rPr>
-          <w:rFonts w:ascii="Times New Roman" w:hAnsi="Times New Roman"/>
-          <w:sz w:val="24"/>
-        </w:rPr>
-        <w:t xml:space="preserve"> </w:t>
-      </w:r>
-      <w:r>
-        <w:rPr>
-          <w:rFonts w:ascii="Times New Roman" w:hAnsi="Times New Roman"/>
-          <w:sz w:val="24"/>
-        </w:rPr>
-        <w:t xml:space="preserve">(Version 9, Swing ed.). Creative Commons CC 4.0. https://math.hws.edu/javanotes/</w:t>
+        <w:t xml:space="preserve">[INSERT SCREENSHOT HERE: IntelliJ Run console showing the program running with answers B, C, C, B, D entered. The console should show all five</w:t>
+      </w:r>
+      <w:r>
+        <w:rPr>
+          <w:rFonts w:ascii="Times New Roman" w:hAnsi="Times New Roman"/>
+          <w:i/>
+          <w:iCs/>
+          <w:sz w:val="24"/>
+        </w:rPr>
+        <w:t xml:space="preserve"> </w:t>
+      </w:r>
+      <w:r>
+        <w:rPr>
+          <w:rFonts w:ascii="Times New Roman" w:hAnsi="Times New Roman"/>
+          <w:i/>
+          <w:iCs/>
+          <w:sz w:val="24"/>
+        </w:rPr>
+        <w:t xml:space="preserve">“Correct!”</w:t>
+      </w:r>
+      <w:r>
+        <w:rPr>
+          <w:rFonts w:ascii="Times New Roman" w:hAnsi="Times New Roman"/>
+          <w:i/>
+          <w:iCs/>
+          <w:sz w:val="24"/>
+        </w:rPr>
+        <w:t xml:space="preserve"> </w:t>
+      </w:r>
+      <w:r>
+        <w:rPr>
+          <w:rFonts w:ascii="Times New Roman" w:hAnsi="Times New Roman"/>
+          <w:i/>
+          <w:iCs/>
+          <w:sz w:val="24"/>
+        </w:rPr>
+        <w:t xml:space="preserve">messages and the final score of 100.0%.]</w:t>
       </w:r>
     </w:p>
     <w:p>
@@ -19145,7 +17436,65 @@
           <w:rFonts w:ascii="Times New Roman" w:hAnsi="Times New Roman"/>
           <w:sz w:val="24"/>
         </w:rPr>
-        <w:t xml:space="preserve">Liang, Y. D. (2020).</w:t>
+        <w:t xml:space="preserve">Expected output for this run:</w:t>
+      </w:r>
+      <w:r>
+        <w:rPr>
+          <w:rFonts w:ascii="Times New Roman" w:hAnsi="Times New Roman"/>
+          <w:sz w:val="24"/>
+        </w:rPr>
+        <w:t xml:space="preserve"> </w:t>
+      </w:r>
+      <w:r>
+        <w:rPr>
+          <w:rFonts w:ascii="Times New Roman" w:hAnsi="Times New Roman"/>
+          <w:sz w:val="24"/>
+        </w:rPr>
+        <w:t xml:space="preserve">- All five answers correct</w:t>
+      </w:r>
+      <w:r>
+        <w:rPr>
+          <w:rFonts w:ascii="Times New Roman" w:hAnsi="Times New Roman"/>
+          <w:sz w:val="24"/>
+        </w:rPr>
+        <w:t xml:space="preserve"> </w:t>
+      </w:r>
+      <w:r>
+        <w:rPr>
+          <w:rFonts w:ascii="Times New Roman" w:hAnsi="Times New Roman"/>
+          <w:sz w:val="24"/>
+        </w:rPr>
+        <w:t xml:space="preserve">- Final score:</w:t>
+      </w:r>
+      <w:r>
+        <w:rPr>
+          <w:rFonts w:ascii="Times New Roman" w:hAnsi="Times New Roman"/>
+          <w:sz w:val="24"/>
+        </w:rPr>
+        <w:t xml:space="preserve"> </w:t>
+      </w:r>
+      <w:r>
+        <w:rPr>
+          <w:rFonts w:ascii="Times New Roman" w:hAnsi="Times New Roman"/>
+          <w:b/>
+          <w:bCs/>
+          <w:sz w:val="24"/>
+        </w:rPr>
+        <w:t xml:space="preserve">100.0%</w:t>
+      </w:r>
+      <w:r>
+        <w:rPr>
+          <w:rFonts w:ascii="Times New Roman" w:hAnsi="Times New Roman"/>
+          <w:sz w:val="24"/>
+        </w:rPr>
+        <w:t xml:space="preserve"> </w:t>
+      </w:r>
+      <w:r>
+        <w:rPr>
+          <w:rFonts w:ascii="Times New Roman" w:hAnsi="Times New Roman"/>
+          <w:sz w:val="24"/>
+        </w:rPr>
+        <w:t xml:space="preserve">- Message:</w:t>
       </w:r>
       <w:r>
         <w:rPr>
@@ -19161,25 +17510,596 @@
           <w:iCs/>
           <w:sz w:val="24"/>
         </w:rPr>
-        <w:t xml:space="preserve">Introduction to Java programming and data structures</w:t>
-      </w:r>
-      <w:r>
-        <w:rPr>
-          <w:rFonts w:ascii="Times New Roman" w:hAnsi="Times New Roman"/>
-          <w:sz w:val="24"/>
-        </w:rPr>
-        <w:t xml:space="preserve"> </w:t>
-      </w:r>
-      <w:r>
-        <w:rPr>
-          <w:rFonts w:ascii="Times New Roman" w:hAnsi="Times New Roman"/>
-          <w:sz w:val="24"/>
-        </w:rPr>
-        <w:t xml:space="preserve">(12th ed.). Pearson.</w:t>
+        <w:t xml:space="preserve">Outstanding! You achieved a perfect score.</w:t>
+      </w:r>
+    </w:p>
+    <w:p>
+      <w:pPr>
+        <w:spacing w:line="480" w:lineRule="exact" w:after="0"/>
+      </w:pPr>
+      <w:r>
+        <w:rPr>
+          <w:rFonts w:ascii="Times New Roman" w:hAnsi="Times New Roman"/>
+          <w:sz w:val="24"/>
+        </w:rPr>
+        <w:pict>
+          <v:rect style="width:0;height:1.5pt" o:hralign="center" o:hrstd="t" o:hr="t"/>
+        </w:pict>
+      </w:r>
+    </w:p>
+    <w:bookmarkEnd w:id="17"/>
+    <w:bookmarkStart w:id="18" w:name="X66a779e9764ba7756d06eb5ae2bbe3cadd6a311"/>
+    <w:p>
+      <w:pPr>
+        <w:pStyle w:val="Heading3"/>
+        <w:spacing w:line="480" w:lineRule="exact" w:after="0"/>
+      </w:pPr>
+      <w:r>
+        <w:rPr>
+          <w:rFonts w:ascii="Times New Roman" w:hAnsi="Times New Roman"/>
+          <w:sz w:val="24"/>
+        </w:rPr>
+        <w:t xml:space="preserve">Screenshot 3 — Output Screenshot: Test Run 2 (Mixed Answers — A, A, C, B, D)</w:t>
+      </w:r>
+    </w:p>
+    <w:p>
+      <w:pPr>
+        <w:pStyle w:val="FirstParagraph"/>
+        <w:spacing w:line="480" w:lineRule="exact" w:after="0"/>
+      </w:pPr>
+      <w:r>
+        <w:rPr>
+          <w:rFonts w:ascii="Times New Roman" w:hAnsi="Times New Roman"/>
+          <w:i/>
+          <w:iCs/>
+          <w:sz w:val="24"/>
+        </w:rPr>
+        <w:t xml:space="preserve">[INSERT SCREENSHOT HERE: IntelliJ Run console showing the program running with answers A, A, C, B, D entered. The console should show two incorrect messages, three correct messages, and a final score of 60.0%.]</w:t>
+      </w:r>
+    </w:p>
+    <w:p>
+      <w:pPr>
+        <w:pStyle w:val="BodyText"/>
+        <w:spacing w:line="480" w:lineRule="exact" w:after="0"/>
+      </w:pPr>
+      <w:r>
+        <w:rPr>
+          <w:rFonts w:ascii="Times New Roman" w:hAnsi="Times New Roman"/>
+          <w:sz w:val="24"/>
+        </w:rPr>
+        <w:t xml:space="preserve">Expected output for this run:</w:t>
+      </w:r>
+      <w:r>
+        <w:rPr>
+          <w:rFonts w:ascii="Times New Roman" w:hAnsi="Times New Roman"/>
+          <w:sz w:val="24"/>
+        </w:rPr>
+        <w:t xml:space="preserve"> </w:t>
+      </w:r>
+      <w:r>
+        <w:rPr>
+          <w:rFonts w:ascii="Times New Roman" w:hAnsi="Times New Roman"/>
+          <w:sz w:val="24"/>
+        </w:rPr>
+        <w:t xml:space="preserve">- Questions 1 and 2 incorrect, Questions 3, 4, and 5 correct</w:t>
+      </w:r>
+      <w:r>
+        <w:rPr>
+          <w:rFonts w:ascii="Times New Roman" w:hAnsi="Times New Roman"/>
+          <w:sz w:val="24"/>
+        </w:rPr>
+        <w:t xml:space="preserve"> </w:t>
+      </w:r>
+      <w:r>
+        <w:rPr>
+          <w:rFonts w:ascii="Times New Roman" w:hAnsi="Times New Roman"/>
+          <w:sz w:val="24"/>
+        </w:rPr>
+        <w:t xml:space="preserve">- Final score:</w:t>
+      </w:r>
+      <w:r>
+        <w:rPr>
+          <w:rFonts w:ascii="Times New Roman" w:hAnsi="Times New Roman"/>
+          <w:sz w:val="24"/>
+        </w:rPr>
+        <w:t xml:space="preserve"> </w:t>
+      </w:r>
+      <w:r>
+        <w:rPr>
+          <w:rFonts w:ascii="Times New Roman" w:hAnsi="Times New Roman"/>
+          <w:b/>
+          <w:bCs/>
+          <w:sz w:val="24"/>
+        </w:rPr>
+        <w:t xml:space="preserve">60.0%</w:t>
+      </w:r>
+      <w:r>
+        <w:rPr>
+          <w:rFonts w:ascii="Times New Roman" w:hAnsi="Times New Roman"/>
+          <w:sz w:val="24"/>
+        </w:rPr>
+        <w:t xml:space="preserve"> </w:t>
+      </w:r>
+      <w:r>
+        <w:rPr>
+          <w:rFonts w:ascii="Times New Roman" w:hAnsi="Times New Roman"/>
+          <w:sz w:val="24"/>
+        </w:rPr>
+        <w:t xml:space="preserve">- Message:</w:t>
+      </w:r>
+      <w:r>
+        <w:rPr>
+          <w:rFonts w:ascii="Times New Roman" w:hAnsi="Times New Roman"/>
+          <w:sz w:val="24"/>
+        </w:rPr>
+        <w:t xml:space="preserve"> </w:t>
+      </w:r>
+      <w:r>
+        <w:rPr>
+          <w:rFonts w:ascii="Times New Roman" w:hAnsi="Times New Roman"/>
+          <w:i/>
+          <w:iCs/>
+          <w:sz w:val="24"/>
+        </w:rPr>
+        <w:t xml:space="preserve">Good effort! Review the questions you missed and try again.</w:t>
+      </w:r>
+    </w:p>
+    <w:p>
+      <w:pPr>
+        <w:spacing w:line="480" w:lineRule="exact" w:after="0"/>
+      </w:pPr>
+      <w:r>
+        <w:rPr>
+          <w:rFonts w:ascii="Times New Roman" w:hAnsi="Times New Roman"/>
+          <w:sz w:val="24"/>
+        </w:rPr>
+        <w:pict>
+          <v:rect style="width:0;height:1.5pt" o:hralign="center" o:hrstd="t" o:hr="t"/>
+        </w:pict>
+      </w:r>
+    </w:p>
+    <w:bookmarkEnd w:id="18"/>
+    <w:bookmarkStart w:id="19" w:name="X1bc01a195ecd55e73371e0e8116ade6ddb4c8d2"/>
+    <w:p>
+      <w:pPr>
+        <w:pStyle w:val="Heading3"/>
+        <w:spacing w:line="480" w:lineRule="exact" w:after="0"/>
+      </w:pPr>
+      <w:r>
+        <w:rPr>
+          <w:rFonts w:ascii="Times New Roman" w:hAnsi="Times New Roman"/>
+          <w:sz w:val="24"/>
+        </w:rPr>
+        <w:t xml:space="preserve">Screenshot 4 — Output Screenshot: Test Run 3 (Invalid Input — X entered for Question 1)</w:t>
+      </w:r>
+    </w:p>
+    <w:p>
+      <w:pPr>
+        <w:pStyle w:val="FirstParagraph"/>
+        <w:spacing w:line="480" w:lineRule="exact" w:after="0"/>
+      </w:pPr>
+      <w:r>
+        <w:rPr>
+          <w:rFonts w:ascii="Times New Roman" w:hAnsi="Times New Roman"/>
+          <w:i/>
+          <w:iCs/>
+          <w:sz w:val="24"/>
+        </w:rPr>
+        <w:t xml:space="preserve">[INSERT SCREENSHOT HERE: IntelliJ Run console showing the program running with X entered for Question 1. The console should show the invalid input message and the question being skipped gracefully.]</w:t>
+      </w:r>
+    </w:p>
+    <w:p>
+      <w:pPr>
+        <w:pStyle w:val="BodyText"/>
+        <w:spacing w:line="480" w:lineRule="exact" w:after="0"/>
+      </w:pPr>
+      <w:r>
+        <w:rPr>
+          <w:rFonts w:ascii="Times New Roman" w:hAnsi="Times New Roman"/>
+          <w:sz w:val="24"/>
+        </w:rPr>
+        <w:t xml:space="preserve">Expected output for this run:</w:t>
+      </w:r>
+      <w:r>
+        <w:rPr>
+          <w:rFonts w:ascii="Times New Roman" w:hAnsi="Times New Roman"/>
+          <w:sz w:val="24"/>
+        </w:rPr>
+        <w:t xml:space="preserve"> </w:t>
+      </w:r>
+      <w:r>
+        <w:rPr>
+          <w:rFonts w:ascii="Times New Roman" w:hAnsi="Times New Roman"/>
+          <w:sz w:val="24"/>
+        </w:rPr>
+        <w:t xml:space="preserve">- Question 1 skipped with message:</w:t>
+      </w:r>
+      <w:r>
+        <w:rPr>
+          <w:rFonts w:ascii="Times New Roman" w:hAnsi="Times New Roman"/>
+          <w:sz w:val="24"/>
+        </w:rPr>
+        <w:t xml:space="preserve"> </w:t>
+      </w:r>
+      <w:r>
+        <w:rPr>
+          <w:rFonts w:ascii="Times New Roman" w:hAnsi="Times New Roman"/>
+          <w:i/>
+          <w:iCs/>
+          <w:sz w:val="24"/>
+        </w:rPr>
+        <w:t xml:space="preserve">Invalid input</w:t>
+      </w:r>
+      <w:r>
+        <w:rPr>
+          <w:rFonts w:ascii="Times New Roman" w:hAnsi="Times New Roman"/>
+          <w:i/>
+          <w:iCs/>
+          <w:sz w:val="24"/>
+        </w:rPr>
+        <w:t xml:space="preserve"> </w:t>
+      </w:r>
+      <w:r>
+        <w:rPr>
+          <w:rFonts w:ascii="Times New Roman" w:hAnsi="Times New Roman"/>
+          <w:i/>
+          <w:iCs/>
+          <w:sz w:val="24"/>
+        </w:rPr>
+        <w:t xml:space="preserve">‘X’</w:t>
+      </w:r>
+      <w:r>
+        <w:rPr>
+          <w:rFonts w:ascii="Times New Roman" w:hAnsi="Times New Roman"/>
+          <w:i/>
+          <w:iCs/>
+          <w:sz w:val="24"/>
+        </w:rPr>
+        <w:t xml:space="preserve">. Please enter A, B, C, or D. Question skipped.</w:t>
+      </w:r>
+      <w:r>
+        <w:rPr>
+          <w:rFonts w:ascii="Times New Roman" w:hAnsi="Times New Roman"/>
+          <w:sz w:val="24"/>
+        </w:rPr>
+        <w:t xml:space="preserve"> </w:t>
+      </w:r>
+      <w:r>
+        <w:rPr>
+          <w:rFonts w:ascii="Times New Roman" w:hAnsi="Times New Roman"/>
+          <w:sz w:val="24"/>
+        </w:rPr>
+        <w:t xml:space="preserve">- Program continues normally to Question 2</w:t>
+      </w:r>
+      <w:r>
+        <w:rPr>
+          <w:rFonts w:ascii="Times New Roman" w:hAnsi="Times New Roman"/>
+          <w:sz w:val="24"/>
+        </w:rPr>
+        <w:t xml:space="preserve"> </w:t>
+      </w:r>
+      <w:r>
+        <w:rPr>
+          <w:rFonts w:ascii="Times New Roman" w:hAnsi="Times New Roman"/>
+          <w:sz w:val="24"/>
+        </w:rPr>
+        <w:t xml:space="preserve">- Demonstrates input validation working correctly</w:t>
+      </w:r>
+    </w:p>
+    <w:p>
+      <w:pPr>
+        <w:spacing w:line="480" w:lineRule="exact" w:after="0"/>
+      </w:pPr>
+      <w:r>
+        <w:rPr>
+          <w:rFonts w:ascii="Times New Roman" w:hAnsi="Times New Roman"/>
+          <w:sz w:val="24"/>
+        </w:rPr>
+        <w:pict>
+          <v:rect style="width:0;height:1.5pt" o:hralign="center" o:hrstd="t" o:hr="t"/>
+        </w:pict>
+      </w:r>
+    </w:p>
+    <w:bookmarkEnd w:id="19"/>
+    <w:bookmarkEnd w:id="20"/>
+    <w:bookmarkStart w:id="21" w:name="Xdab352a2c567ffa56a5eaaca28c02926b5292cc"/>
+    <w:p>
+      <w:pPr>
+        <w:pStyle w:val="Heading2"/>
+        <w:spacing w:line="480" w:lineRule="exact" w:after="0"/>
+      </w:pPr>
+      <w:r>
+        <w:rPr>
+          <w:rFonts w:ascii="Times New Roman" w:hAnsi="Times New Roman"/>
+          <w:sz w:val="24"/>
+        </w:rPr>
+        <w:t xml:space="preserve">8. Code Style and Readability (Rubric Criterion 6)</w:t>
+      </w:r>
+    </w:p>
+    <w:p>
+      <w:pPr>
+        <w:pStyle w:val="FirstParagraph"/>
+        <w:spacing w:line="480" w:lineRule="exact" w:after="0"/>
+      </w:pPr>
+      <w:r>
+        <w:rPr>
+          <w:rFonts w:ascii="Times New Roman" w:hAnsi="Times New Roman"/>
+          <w:sz w:val="24"/>
+        </w:rPr>
+        <w:t xml:space="preserve">The code follows consistent four-space indentation throughout. Every logical section — setup, each question, and score output — is separated by a clearly labeled comment block. Variable names are descriptive (</w:t>
+      </w:r>
+      <w:r>
+        <w:rPr>
+          <w:rStyle w:val="VerbatimChar"/>
+          <w:rFonts w:ascii="Times New Roman" w:hAnsi="Times New Roman"/>
+          <w:sz w:val="24"/>
+        </w:rPr>
+        <w:t xml:space="preserve">score</w:t>
+      </w:r>
+      <w:r>
+        <w:rPr>
+          <w:rFonts w:ascii="Times New Roman" w:hAnsi="Times New Roman"/>
+          <w:sz w:val="24"/>
+        </w:rPr>
+        <w:t xml:space="preserve">,</w:t>
+      </w:r>
+      <w:r>
+        <w:rPr>
+          <w:rFonts w:ascii="Times New Roman" w:hAnsi="Times New Roman"/>
+          <w:sz w:val="24"/>
+        </w:rPr>
+        <w:t xml:space="preserve"> </w:t>
+      </w:r>
+      <w:r>
+        <w:rPr>
+          <w:rStyle w:val="VerbatimChar"/>
+          <w:rFonts w:ascii="Times New Roman" w:hAnsi="Times New Roman"/>
+          <w:sz w:val="24"/>
+        </w:rPr>
+        <w:t xml:space="preserve">totalQuestions</w:t>
+      </w:r>
+      <w:r>
+        <w:rPr>
+          <w:rFonts w:ascii="Times New Roman" w:hAnsi="Times New Roman"/>
+          <w:sz w:val="24"/>
+        </w:rPr>
+        <w:t xml:space="preserve">,</w:t>
+      </w:r>
+      <w:r>
+        <w:rPr>
+          <w:rFonts w:ascii="Times New Roman" w:hAnsi="Times New Roman"/>
+          <w:sz w:val="24"/>
+        </w:rPr>
+        <w:t xml:space="preserve"> </w:t>
+      </w:r>
+      <w:r>
+        <w:rPr>
+          <w:rStyle w:val="VerbatimChar"/>
+          <w:rFonts w:ascii="Times New Roman" w:hAnsi="Times New Roman"/>
+          <w:sz w:val="24"/>
+        </w:rPr>
+        <w:t xml:space="preserve">percentage</w:t>
+      </w:r>
+      <w:r>
+        <w:rPr>
+          <w:rFonts w:ascii="Times New Roman" w:hAnsi="Times New Roman"/>
+          <w:sz w:val="24"/>
+        </w:rPr>
+        <w:t xml:space="preserve">,</w:t>
+      </w:r>
+      <w:r>
+        <w:rPr>
+          <w:rFonts w:ascii="Times New Roman" w:hAnsi="Times New Roman"/>
+          <w:sz w:val="24"/>
+        </w:rPr>
+        <w:t xml:space="preserve"> </w:t>
+      </w:r>
+      <w:r>
+        <w:rPr>
+          <w:rStyle w:val="VerbatimChar"/>
+          <w:rFonts w:ascii="Times New Roman" w:hAnsi="Times New Roman"/>
+          <w:sz w:val="24"/>
+        </w:rPr>
+        <w:t xml:space="preserve">ans1</w:t>
+      </w:r>
+      <w:r>
+        <w:rPr>
+          <w:rFonts w:ascii="Times New Roman" w:hAnsi="Times New Roman"/>
+          <w:sz w:val="24"/>
+        </w:rPr>
+        <w:t xml:space="preserve">–</w:t>
+      </w:r>
+      <w:r>
+        <w:rPr>
+          <w:rStyle w:val="VerbatimChar"/>
+          <w:rFonts w:ascii="Times New Roman" w:hAnsi="Times New Roman"/>
+          <w:sz w:val="24"/>
+        </w:rPr>
+        <w:t xml:space="preserve">ans5</w:t>
+      </w:r>
+      <w:r>
+        <w:rPr>
+          <w:rFonts w:ascii="Times New Roman" w:hAnsi="Times New Roman"/>
+          <w:sz w:val="24"/>
+        </w:rPr>
+        <w:t xml:space="preserve">) and follow Java’s camelCase convention (Eck, 2022, §2.2). There is no redundant or dead code. The</w:t>
+      </w:r>
+      <w:r>
+        <w:rPr>
+          <w:rFonts w:ascii="Times New Roman" w:hAnsi="Times New Roman"/>
+          <w:sz w:val="24"/>
+        </w:rPr>
+        <w:t xml:space="preserve"> </w:t>
+      </w:r>
+      <w:r>
+        <w:rPr>
+          <w:rStyle w:val="VerbatimChar"/>
+          <w:rFonts w:ascii="Times New Roman" w:hAnsi="Times New Roman"/>
+          <w:sz w:val="24"/>
+        </w:rPr>
+        <w:t xml:space="preserve">Scanner</w:t>
+      </w:r>
+      <w:r>
+        <w:rPr>
+          <w:rFonts w:ascii="Times New Roman" w:hAnsi="Times New Roman"/>
+          <w:sz w:val="24"/>
+        </w:rPr>
+        <w:t xml:space="preserve"> </w:t>
+      </w:r>
+      <w:r>
+        <w:rPr>
+          <w:rFonts w:ascii="Times New Roman" w:hAnsi="Times New Roman"/>
+          <w:sz w:val="24"/>
+        </w:rPr>
+        <w:t xml:space="preserve">is closed at the end of</w:t>
+      </w:r>
+      <w:r>
+        <w:rPr>
+          <w:rFonts w:ascii="Times New Roman" w:hAnsi="Times New Roman"/>
+          <w:sz w:val="24"/>
+        </w:rPr>
+        <w:t xml:space="preserve"> </w:t>
+      </w:r>
+      <w:r>
+        <w:rPr>
+          <w:rStyle w:val="VerbatimChar"/>
+          <w:rFonts w:ascii="Times New Roman" w:hAnsi="Times New Roman"/>
+          <w:sz w:val="24"/>
+        </w:rPr>
+        <w:t xml:space="preserve">main</w:t>
+      </w:r>
+      <w:r>
+        <w:rPr>
+          <w:rFonts w:ascii="Times New Roman" w:hAnsi="Times New Roman"/>
+          <w:sz w:val="24"/>
+        </w:rPr>
+        <w:t xml:space="preserve"> </w:t>
+      </w:r>
+      <w:r>
+        <w:rPr>
+          <w:rFonts w:ascii="Times New Roman" w:hAnsi="Times New Roman"/>
+          <w:sz w:val="24"/>
+        </w:rPr>
+        <w:t xml:space="preserve">to avoid a resource leak. The Javadoc comment at the top of the class documents the program’s purpose, flow, author, and course, making the code immediately understandable to any reader.</w:t>
+      </w:r>
+    </w:p>
+    <w:p>
+      <w:pPr>
+        <w:spacing w:line="480" w:lineRule="exact" w:after="0"/>
+      </w:pPr>
+      <w:r>
+        <w:rPr>
+          <w:rFonts w:ascii="Times New Roman" w:hAnsi="Times New Roman"/>
+          <w:sz w:val="24"/>
+        </w:rPr>
+        <w:pict>
+          <v:rect style="width:0;height:1.5pt" o:hralign="center" o:hrstd="t" o:hr="t"/>
+        </w:pict>
       </w:r>
     </w:p>
     <w:bookmarkEnd w:id="21"/>
+    <w:bookmarkStart w:id="22" w:name="references"/>
+    <w:p>
+      <w:pPr>
+        <w:pStyle w:val="Heading2"/>
+        <w:spacing w:line="480" w:lineRule="exact" w:after="0"/>
+      </w:pPr>
+      <w:r>
+        <w:rPr>
+          <w:rFonts w:ascii="Times New Roman" w:hAnsi="Times New Roman"/>
+          <w:sz w:val="24"/>
+        </w:rPr>
+        <w:t xml:space="preserve">References</w:t>
+      </w:r>
+    </w:p>
+    <w:p>
+      <w:pPr>
+        <w:pStyle w:val="FirstParagraph"/>
+        <w:spacing w:line="480" w:lineRule="exact" w:after="0"/>
+      </w:pPr>
+      <w:r>
+        <w:rPr>
+          <w:rFonts w:ascii="Times New Roman" w:hAnsi="Times New Roman"/>
+          <w:sz w:val="24"/>
+        </w:rPr>
+        <w:t xml:space="preserve">Eck, D. J. (2022).</w:t>
+      </w:r>
+      <w:r>
+        <w:rPr>
+          <w:rFonts w:ascii="Times New Roman" w:hAnsi="Times New Roman"/>
+          <w:sz w:val="24"/>
+        </w:rPr>
+        <w:t xml:space="preserve"> </w:t>
+      </w:r>
+      <w:r>
+        <w:rPr>
+          <w:rFonts w:ascii="Times New Roman" w:hAnsi="Times New Roman"/>
+          <w:i/>
+          <w:iCs/>
+          <w:sz w:val="24"/>
+        </w:rPr>
+        <w:t xml:space="preserve">Introduction to programming using Java</w:t>
+      </w:r>
+      <w:r>
+        <w:rPr>
+          <w:rFonts w:ascii="Times New Roman" w:hAnsi="Times New Roman"/>
+          <w:sz w:val="24"/>
+        </w:rPr>
+        <w:t xml:space="preserve"> </w:t>
+      </w:r>
+      <w:r>
+        <w:rPr>
+          <w:rFonts w:ascii="Times New Roman" w:hAnsi="Times New Roman"/>
+          <w:sz w:val="24"/>
+        </w:rPr>
+        <w:t xml:space="preserve">(Version 9, Swing ed.). Creative Commons CC 4.0. https://math.hws.edu/javanotes/</w:t>
+      </w:r>
+    </w:p>
+    <w:p>
+      <w:pPr>
+        <w:pStyle w:val="BodyText"/>
+        <w:spacing w:line="480" w:lineRule="exact" w:after="0"/>
+      </w:pPr>
+      <w:r>
+        <w:rPr>
+          <w:rFonts w:ascii="Times New Roman" w:hAnsi="Times New Roman"/>
+          <w:sz w:val="24"/>
+        </w:rPr>
+        <w:t xml:space="preserve">Liang, Y. D. (2020).</w:t>
+      </w:r>
+      <w:r>
+        <w:rPr>
+          <w:rFonts w:ascii="Times New Roman" w:hAnsi="Times New Roman"/>
+          <w:sz w:val="24"/>
+        </w:rPr>
+        <w:t xml:space="preserve"> </w:t>
+      </w:r>
+      <w:r>
+        <w:rPr>
+          <w:rFonts w:ascii="Times New Roman" w:hAnsi="Times New Roman"/>
+          <w:i/>
+          <w:iCs/>
+          <w:sz w:val="24"/>
+        </w:rPr>
+        <w:t xml:space="preserve">Introduction to Java programming and data structures</w:t>
+      </w:r>
+      <w:r>
+        <w:rPr>
+          <w:rFonts w:ascii="Times New Roman" w:hAnsi="Times New Roman"/>
+          <w:sz w:val="24"/>
+        </w:rPr>
+        <w:t xml:space="preserve"> </w:t>
+      </w:r>
+      <w:r>
+        <w:rPr>
+          <w:rFonts w:ascii="Times New Roman" w:hAnsi="Times New Roman"/>
+          <w:sz w:val="24"/>
+        </w:rPr>
+        <w:t xml:space="preserve">(12th ed.). Pearson.</w:t>
+      </w:r>
+    </w:p>
     <w:bookmarkEnd w:id="22"/>
+    <w:bookmarkEnd w:id="23"/>
     <w:sectPr>
       <w:footnotePr>
         <w:numRestart w:val="eachSect"/>

</xml_diff>